<commit_message>
Sync schedule files 2026-04-23 07:52
</commit_message>
<xml_diff>
--- a/schedule/23.04.2026 ЧЕТВЕРГ дистант.docx
+++ b/schedule/23.04.2026 ЧЕТВЕРГ дистант.docx
@@ -1,6 +1,6 @@
 
 <file path=word/document.xml><?xml version="1.0" encoding="utf-8"?>
-<w:document xmlns:r="http://schemas.openxmlformats.org/officeDocument/2006/relationships" xmlns:w="http://schemas.openxmlformats.org/wordprocessingml/2006/main" xmlns:vyd="http://volga.yandex.com/schemas/document/model" xmlns:mc="http://schemas.openxmlformats.org/markup-compatibility/2006" w:conformance="transitional" mc:Ignorable="vyd">
+<w:document xmlns:r="http://schemas.openxmlformats.org/officeDocument/2006/relationships" xmlns:mc="http://schemas.openxmlformats.org/markup-compatibility/2006" xmlns:vyd="http://volga.yandex.com/schemas/document/model" xmlns:w="http://schemas.openxmlformats.org/wordprocessingml/2006/main" w:conformance="transitional" mc:Ignorable="vyd">
   <w:background w:color="FFFFFF"/>
   <w:body vyd:_id="vyd:00000000000001">
     <w:p vyd:_id="vyd:000000000002hp">
@@ -12,13 +12,6 @@
           <w:sz w:val="20"/>
         </w:rPr>
       </w:pPr>
-      <w:r>
-        <w:rPr>
-          <w:rFonts w:ascii="Times New Roman" w:hAnsi="Times New Roman" w:cs="Times New Roman"/>
-          <w:sz w:val="20"/>
-        </w:rPr>
-        <w:t vyd:_id="vyd:mob1j0ttbhv4yh">Непр</w:t>
-      </w:r>
     </w:p>
     <w:p vyd:_id="vyd:000000000002hn">
       <w:pPr>
@@ -107,13 +100,13 @@
       <w:tblGrid>
         <w:gridCol w:w="226.759"/>
         <w:gridCol w:w="673.242"/>
-        <w:gridCol w:w="1459.827"/>
+        <w:gridCol w:w="1484.5"/>
+        <w:gridCol w:w="1881.638"/>
         <w:gridCol w:w="1906.31"/>
         <w:gridCol w:w="1906.31"/>
         <w:gridCol w:w="1906.31"/>
-        <w:gridCol w:w="1906.31"/>
-        <w:gridCol w:w="1906.31"/>
-        <w:gridCol w:w="1906.31"/>
+        <w:gridCol w:w="1927.431"/>
+        <w:gridCol w:w="1885.189"/>
         <w:gridCol w:w="1906.31"/>
       </w:tblGrid>
       <w:tr vyd:_id="vyd:000000000002gq">
@@ -714,7 +707,7 @@
       </w:tr>
       <w:tr vyd:_id="vyd:000000000002f7">
         <w:trPr>
-          <w:trHeight w:val="280" w:hRule="atLeast"/>
+          <w:trHeight w:val="834.196" w:hRule="atLeast"/>
         </w:trPr>
         <w:tc vyd:_id="vyd:000000000002fx">
           <w:tcPr>
@@ -1211,10 +1204,17 @@
               <w:spacing w:lineRule="auto" w:line="240" w:before="0" w:after="0"/>
               <w:rPr>
                 <w:rFonts w:ascii="Times New Roman" w:hAnsi="Times New Roman" w:cs="Times New Roman"/>
-                <w:sz w:val="18"/>
-                <w:szCs w:val="18"/>
-              </w:rPr>
-            </w:pPr>
+                <w:sz w:val="14"/>
+                <w:szCs w:val="18"/>
+              </w:rPr>
+            </w:pPr>
+            <w:r>
+              <w:rPr>
+                <w:rFonts w:ascii="Times New Roman" w:hAnsi="Times New Roman" w:cs="Times New Roman"/>
+                <w:sz w:val="18"/>
+              </w:rPr>
+              <w:t vyd:_id="vyd:mob2uzb13hch7q">Квантовая оптика.</w:t>
+            </w:r>
           </w:p>
         </w:tc>
         <w:tc vyd:_id="vyd:000000000002eq">
@@ -1237,6 +1237,13 @@
                 <w:szCs w:val="18"/>
               </w:rPr>
             </w:pPr>
+            <w:r>
+              <w:rPr>
+                <w:rFonts w:ascii="Times New Roman" w:hAnsi="Times New Roman" w:cs="Times New Roman"/>
+                <w:sz w:val="18"/>
+              </w:rPr>
+              <w:t vyd:_id="vyd:mob3co4h2wa7jm">Самостоятельные и служебные части речи. Повторение</w:t>
+            </w:r>
           </w:p>
         </w:tc>
         <w:tc vyd:_id="vyd:000000000002eo">
@@ -1259,6 +1266,13 @@
                 <w:szCs w:val="18"/>
               </w:rPr>
             </w:pPr>
+            <w:r>
+              <w:rPr>
+                <w:rFonts w:ascii="Times New Roman" w:hAnsi="Times New Roman" w:cs="Times New Roman"/>
+                <w:sz w:val="18"/>
+              </w:rPr>
+              <w:t vyd:_id="vyd:mob38o3d70hyjl">Написать конспект: история развития волейбола</w:t>
+            </w:r>
           </w:p>
         </w:tc>
       </w:tr>
@@ -1457,6 +1471,13 @@
                 <w:szCs w:val="18"/>
               </w:rPr>
             </w:pPr>
+            <w:r>
+              <w:rPr>
+                <w:rFonts w:ascii="Times New Roman" w:hAnsi="Times New Roman" w:cs="Times New Roman"/>
+                <w:sz w:val="18"/>
+              </w:rPr>
+              <w:t vyd:_id="vyd:mob2uq5iu6emjo">мах</w:t>
+            </w:r>
           </w:p>
         </w:tc>
         <w:tc vyd:_id="vyd:000000000002e6">
@@ -1471,14 +1492,20 @@
           <w:p vyd:_id="vyd:000000000002e7">
             <w:pPr>
               <w:pStyle w:val="Normal"/>
-              <w:snapToGrid w:val="0"/>
-              <w:spacing w:lineRule="auto" w:line="240" w:before="0" w:after="0"/>
-              <w:rPr>
-                <w:rFonts w:ascii="Times New Roman" w:hAnsi="Times New Roman" w:cs="Times New Roman"/>
-                <w:sz w:val="18"/>
-                <w:szCs w:val="18"/>
-              </w:rPr>
-            </w:pPr>
+              <w:spacing w:lineRule="auto" w:line="240" w:before="0" w:after="0"/>
+              <w:rPr>
+                <w:rFonts w:ascii="Times New Roman" w:hAnsi="Times New Roman" w:cs="Times New Roman"/>
+                <w:sz w:val="18"/>
+                <w:szCs w:val="18"/>
+              </w:rPr>
+            </w:pPr>
+            <w:r>
+              <w:rPr>
+                <w:rFonts w:ascii="Times New Roman" w:hAnsi="Times New Roman" w:cs="Times New Roman"/>
+                <w:sz w:val="18"/>
+              </w:rPr>
+              <w:t vyd:_id="vyd:mob39wtzh4cmuk">МАХ</w:t>
+            </w:r>
           </w:p>
         </w:tc>
         <w:tc vyd:_id="vyd:000000000002e4">
@@ -1501,6 +1528,13 @@
                 <w:szCs w:val="18"/>
               </w:rPr>
             </w:pPr>
+            <w:r>
+              <w:rPr>
+                <w:rFonts w:ascii="Times New Roman" w:hAnsi="Times New Roman" w:cs="Times New Roman"/>
+                <w:sz w:val="18"/>
+              </w:rPr>
+              <w:t vyd:_id="vyd:mob3djoxiv0pws">Ma</w:t>
+            </w:r>
           </w:p>
         </w:tc>
       </w:tr>
@@ -1658,7 +1692,7 @@
                 <w:rFonts w:ascii="Times New Roman" w:hAnsi="Times New Roman" w:cs="Times New Roman"/>
                 <w:sz w:val="18"/>
               </w:rPr>
-              <w:t vyd:_id="vyd:mob1h4qb1gutuq">Продифференцироваь функции</w:t>
+              <w:t vyd:_id="vyd:mob1h4qb1gutuq">Продифференцировать функции</w:t>
             </w:r>
           </w:p>
         </w:tc>
@@ -1691,6 +1725,44 @@
           <w:p vyd:_id="vyd:000000000002dp">
             <w:pPr>
               <w:pStyle w:val="Normal"/>
+              <w:spacing w:lineRule="auto" w:line="240" w:before="0" w:after="0"/>
+              <w:rPr>
+                <w:rFonts w:ascii="Times New Roman" w:hAnsi="Times New Roman" w:cs="Times New Roman"/>
+                <w:sz w:val="14"/>
+              </w:rPr>
+            </w:pPr>
+            <w:r>
+              <w:rPr>
+                <w:rFonts w:ascii="Times New Roman" w:hAnsi="Times New Roman" w:cs="Times New Roman"/>
+                <w:sz w:val="18"/>
+              </w:rPr>
+              <w:t vyd:_id="vyd:mob4dca8nwg8dj">О</w:t>
+            </w:r>
+            <w:r>
+              <w:rPr>
+                <w:rFonts w:ascii="Times New Roman" w:hAnsi="Times New Roman" w:cs="Times New Roman"/>
+                <w:sz w:val="18"/>
+              </w:rPr>
+              <w:t vyd:_id="vyd:mob4dca27wgwzj" xml:space="preserve">тветить  на вопросы в конце раздела </w:t>
+            </w:r>
+            <w:r>
+              <w:rPr>
+                <w:rFonts w:ascii="Times New Roman" w:hAnsi="Times New Roman" w:cs="Times New Roman"/>
+                <w:sz w:val="24"/>
+              </w:rPr>
+              <w:t vyd:_id="vyd:mob4dc9wb206u1">.</w:t>
+            </w:r>
+            <w:r>
+              <w:rPr>
+                <w:rFonts w:ascii="Times New Roman" w:hAnsi="Times New Roman" w:cs="Times New Roman"/>
+                <w:sz w:val="20"/>
+              </w:rPr>
+              <w:t vyd:_id="vyd:mob4dc9rc66159">(Учебник физики В.Ф.Дмитриева)</w:t>
+            </w:r>
+          </w:p>
+          <w:p vyd:_id="vyd:mob4dc9ie0eef7">
+            <w:pPr>
+              <w:pStyle w:val="Normal"/>
               <w:snapToGrid w:val="0"/>
               <w:spacing w:lineRule="auto" w:line="240" w:before="0" w:after="0"/>
               <w:rPr>
@@ -1721,6 +1793,13 @@
                 <w:szCs w:val="18"/>
               </w:rPr>
             </w:pPr>
+            <w:r>
+              <w:rPr>
+                <w:rFonts w:ascii="Times New Roman" w:hAnsi="Times New Roman" w:cs="Times New Roman"/>
+                <w:sz w:val="18"/>
+              </w:rPr>
+              <w:t vyd:_id="vyd:mob3f6gi0fxhqq">Выполнить упражнения</w:t>
+            </w:r>
           </w:p>
         </w:tc>
         <w:tc vyd:_id="vyd:000000000002dk">
@@ -2163,6 +2242,14 @@
                 <w:szCs w:val="24"/>
               </w:rPr>
             </w:pPr>
+            <w:r>
+              <w:rPr>
+                <w:rFonts w:ascii="Times New Roman" w:hAnsi="Times New Roman" w:cs="Times New Roman"/>
+                <w:sz w:val="24"/>
+                <w:color w:val="000000"/>
+              </w:rPr>
+              <w:t vyd:_id="vyd:mob4ds1n29byhy">Решение практкоориентированных заданий</w:t>
+            </w:r>
           </w:p>
         </w:tc>
         <w:tc vyd:_id="vyd:000000000002ce">
@@ -2238,6 +2325,13 @@
                 <w:szCs w:val="24"/>
               </w:rPr>
             </w:pPr>
+            <w:r>
+              <w:rPr>
+                <w:rFonts w:ascii="Times New Roman" w:hAnsi="Times New Roman" w:cs="Times New Roman"/>
+                <w:sz w:val="20"/>
+              </w:rPr>
+              <w:t vyd:_id="vyd:mob2rulbfc6yzw" xml:space="preserve">Квантовая  оптика.  </w:t>
+            </w:r>
           </w:p>
         </w:tc>
         <w:tc vyd:_id="vyd:mob166gcgl5b94">
@@ -2279,7 +2373,7 @@
               <w:rPr>
                 <w:rFonts w:ascii="Times New Roman" w:hAnsi="Times New Roman" w:cs="Times New Roman"/>
               </w:rPr>
-              <w:t vyd:_id="vyd:mob1jt1f37vk1n">Производна</w:t>
+              <w:t vyd:_id="vyd:mob1jt1f37vk1n">Производная</w:t>
             </w:r>
           </w:p>
         </w:tc>
@@ -2299,8 +2393,16 @@
               <w:spacing w:lineRule="auto" w:line="240" w:before="0" w:after="0"/>
               <w:rPr>
                 <w:rFonts w:ascii="Times New Roman" w:hAnsi="Times New Roman" w:cs="Times New Roman"/>
-              </w:rPr>
-            </w:pPr>
+                <w:sz w:val="18"/>
+              </w:rPr>
+            </w:pPr>
+            <w:r>
+              <w:rPr>
+                <w:rFonts w:ascii="Times New Roman" w:hAnsi="Times New Roman" w:cs="Times New Roman"/>
+                <w:sz w:val="18"/>
+              </w:rPr>
+              <w:t vyd:_id="vyd:mob3ftcd5ryxoq">Б. Пастернак. Биография и творчество</w:t>
+            </w:r>
           </w:p>
         </w:tc>
         <w:tc vyd:_id="vyd:000000000002c4">
@@ -2414,6 +2516,14 @@
                 <w:szCs w:val="24"/>
               </w:rPr>
             </w:pPr>
+            <w:r>
+              <w:rPr>
+                <w:rFonts w:ascii="Times New Roman" w:hAnsi="Times New Roman" w:cs="Times New Roman"/>
+                <w:sz w:val="24"/>
+                <w:color w:val="000000"/>
+              </w:rPr>
+              <w:t vyd:_id="vyd:mob4e7wvm47p3k">макс</w:t>
+            </w:r>
           </w:p>
         </w:tc>
         <w:tc vyd:_id="vyd:000000000002bu">
@@ -2489,6 +2599,13 @@
                 <w:szCs w:val="24"/>
               </w:rPr>
             </w:pPr>
+            <w:r>
+              <w:rPr>
+                <w:rFonts w:ascii="Times New Roman" w:hAnsi="Times New Roman" w:cs="Times New Roman"/>
+                <w:sz w:val="24"/>
+              </w:rPr>
+              <w:t vyd:_id="vyd:mob2gpw4sbb5su">мах</w:t>
+            </w:r>
           </w:p>
         </w:tc>
         <w:tc vyd:_id="vyd:mob166gikp3mce">
@@ -2546,12 +2663,19 @@
           <w:p vyd:_id="vyd:000000000002bn">
             <w:pPr>
               <w:pStyle w:val="Normal"/>
-              <w:snapToGrid w:val="0"/>
-              <w:spacing w:lineRule="auto" w:line="240" w:before="0" w:after="0"/>
-              <w:rPr>
-                <w:rFonts w:ascii="Times New Roman" w:hAnsi="Times New Roman" w:cs="Times New Roman"/>
-              </w:rPr>
-            </w:pPr>
+              <w:spacing w:lineRule="auto" w:line="240" w:before="0" w:after="0"/>
+              <w:rPr>
+                <w:rFonts w:ascii="Times New Roman" w:hAnsi="Times New Roman" w:cs="Times New Roman"/>
+                <w:sz w:val="18"/>
+              </w:rPr>
+            </w:pPr>
+            <w:r>
+              <w:rPr>
+                <w:rFonts w:ascii="Times New Roman" w:hAnsi="Times New Roman" w:cs="Times New Roman"/>
+                <w:sz w:val="14"/>
+              </w:rPr>
+              <w:t vyd:_id="vyd:mob3a1c856g3ak">МАХ</w:t>
+            </w:r>
           </w:p>
         </w:tc>
         <w:tc vyd:_id="vyd:000000000002bk">
@@ -2720,6 +2844,37 @@
           <w:p vyd:_id="vyd:000000000002b7">
             <w:pPr>
               <w:pStyle w:val="Normal"/>
+              <w:spacing w:lineRule="auto" w:line="240" w:before="0" w:after="0"/>
+              <w:rPr>
+                <w:rFonts w:ascii="Times New Roman" w:hAnsi="Times New Roman" w:cs="Times New Roman"/>
+                <w:sz w:val="24"/>
+              </w:rPr>
+            </w:pPr>
+            <w:r>
+              <w:rPr>
+                <w:rFonts w:ascii="Times New Roman" w:hAnsi="Times New Roman" w:cs="Times New Roman"/>
+                <w:sz w:val="20"/>
+              </w:rPr>
+              <w:t vyd:_id="vyd:mob4crooqfj75x">Ответить на вопросы  в конце раздела.</w:t>
+            </w:r>
+            <w:r>
+              <w:rPr>
+                <w:rFonts w:ascii="Times New Roman" w:hAnsi="Times New Roman" w:cs="Times New Roman"/>
+                <w:sz w:val="20"/>
+              </w:rPr>
+              <w:t vyd:_id="vyd:mob4croikw6280">.</w:t>
+            </w:r>
+            <w:r>
+              <w:rPr>
+                <w:rFonts w:ascii="Times New Roman" w:hAnsi="Times New Roman" w:cs="Times New Roman"/>
+                <w:sz w:val="20"/>
+              </w:rPr>
+              <w:t vyd:_id="vyd:mob4crodewlur8">(Учебник физики В.Ф.Дмитриева)</w:t>
+            </w:r>
+          </w:p>
+          <w:p vyd:_id="vyd:mob4cro39bj7xp">
+            <w:pPr>
+              <w:pStyle w:val="Normal"/>
               <w:snapToGrid w:val="0"/>
               <w:spacing w:lineRule="auto" w:line="240" w:before="0" w:after="0"/>
               <w:rPr>
@@ -2769,7 +2924,7 @@
               <w:rPr>
                 <w:rFonts w:ascii="Times New Roman" w:hAnsi="Times New Roman" w:cs="Times New Roman"/>
               </w:rPr>
-              <w:t vyd:_id="vyd:mob1k62mtkbqyc">Продифферецировать функции</w:t>
+              <w:t vyd:_id="vyd:mob1k62mtkbqyc">Продифференцировать функции</w:t>
             </w:r>
           </w:p>
         </w:tc>
@@ -2789,8 +2944,16 @@
               <w:spacing w:lineRule="auto" w:line="240" w:before="0" w:after="0"/>
               <w:rPr>
                 <w:rFonts w:ascii="Times New Roman" w:hAnsi="Times New Roman" w:cs="Times New Roman"/>
-              </w:rPr>
-            </w:pPr>
+                <w:sz w:val="18"/>
+              </w:rPr>
+            </w:pPr>
+            <w:r>
+              <w:rPr>
+                <w:rFonts w:ascii="Times New Roman" w:hAnsi="Times New Roman" w:cs="Times New Roman"/>
+                <w:sz w:val="18"/>
+              </w:rPr>
+              <w:t vyd:_id="vyd:mob3g7jbzzja93">Выуч. Наизусть стихотворение «Зимяя ночь»</w:t>
+            </w:r>
           </w:p>
         </w:tc>
         <w:tc vyd:_id="vyd:000000000002b0">
@@ -3218,10 +3381,17 @@
               <w:spacing w:lineRule="auto" w:line="240" w:before="0" w:after="0"/>
               <w:rPr>
                 <w:rFonts w:ascii="Times New Roman" w:hAnsi="Times New Roman" w:cs="Times New Roman"/>
-                <w:sz w:val="14"/>
+                <w:sz w:val="22"/>
                 <w:szCs w:val="14"/>
               </w:rPr>
             </w:pPr>
+            <w:r>
+              <w:rPr>
+                <w:rFonts w:ascii="Times New Roman" w:hAnsi="Times New Roman" w:cs="Times New Roman"/>
+                <w:sz w:val="22"/>
+              </w:rPr>
+              <w:t vyd:_id="vyd:mob3l8k48jvuje">Создание различных видов страниц</w:t>
+            </w:r>
           </w:p>
         </w:tc>
         <w:tc vyd:_id="vyd:0000000000029v">
@@ -3236,12 +3406,18 @@
           <w:p vyd:_id="vyd:0000000000029w">
             <w:pPr>
               <w:pStyle w:val="Normal"/>
-              <w:snapToGrid w:val="0"/>
-              <w:spacing w:lineRule="auto" w:line="240" w:before="0" w:after="0"/>
-              <w:rPr>
-                <w:rFonts w:ascii="Times New Roman" w:hAnsi="Times New Roman" w:cs="Times New Roman"/>
-              </w:rPr>
-            </w:pPr>
+              <w:spacing w:lineRule="auto" w:line="240" w:before="0" w:after="0"/>
+              <w:rPr>
+                <w:rFonts w:ascii="Times New Roman" w:hAnsi="Times New Roman" w:cs="Times New Roman"/>
+              </w:rPr>
+            </w:pPr>
+            <w:r>
+              <w:rPr>
+                <w:rFonts w:ascii="Times New Roman" w:hAnsi="Times New Roman" w:cs="Times New Roman"/>
+                <w:sz w:val="18"/>
+              </w:rPr>
+              <w:t vyd:_id="vyd:mob3diqzhjc45d">Самостоятельные и служебные части речи. Повторение</w:t>
+            </w:r>
           </w:p>
         </w:tc>
         <w:tc vyd:_id="vyd:0000000000029t">
@@ -3343,6 +3519,12 @@
                 <w:rFonts w:ascii="Times New Roman" w:hAnsi="Times New Roman" w:cs="Times New Roman"/>
               </w:rPr>
             </w:pPr>
+            <w:r>
+              <w:rPr>
+                <w:rFonts w:ascii="Times New Roman" w:hAnsi="Times New Roman" w:cs="Times New Roman"/>
+              </w:rPr>
+              <w:t vyd:_id="vyd:mob3l5kxapz7ep">Сущность понятия «редактирование», задачи редактирования эскизов, 3d моделей, основные способы редактирования 3 D моделей</w:t>
+            </w:r>
           </w:p>
         </w:tc>
         <w:tc vyd:_id="vyd:0000000000029l">
@@ -3365,12 +3547,15 @@
                 <w:szCs w:val="24"/>
               </w:rPr>
             </w:pPr>
+            <w:r>
+              <w:t vyd:_id="vyd:mob26nzby75m4y">Закрепление пройденного материала по теме: ". Социальные нормы и социальный контроль" и "Политика и власть"</w:t>
+            </w:r>
           </w:p>
         </w:tc>
       </w:tr>
       <w:tr vyd:_id="vyd:00000000000290">
         <w:trPr>
-          <w:trHeight w:val="23" w:hRule="atLeast"/>
+          <w:trHeight w:val="576.025" w:hRule="atLeast"/>
         </w:trPr>
         <w:tc vyd:_id="vyd:0000000000029i">
           <w:tcPr>
@@ -3444,6 +3629,13 @@
                 <w:szCs w:val="14"/>
               </w:rPr>
             </w:pPr>
+            <w:r>
+              <w:rPr>
+                <w:rFonts w:ascii="Times New Roman" w:hAnsi="Times New Roman" w:cs="Times New Roman"/>
+                <w:sz w:val="14"/>
+              </w:rPr>
+              <w:t vyd:_id="vyd:mob3lqa07it493">MAX</w:t>
+            </w:r>
           </w:p>
         </w:tc>
         <w:tc vyd:_id="vyd:0000000000029b">
@@ -3458,12 +3650,18 @@
           <w:p vyd:_id="vyd:0000000000029c">
             <w:pPr>
               <w:pStyle w:val="Normal"/>
-              <w:snapToGrid w:val="0"/>
-              <w:spacing w:lineRule="auto" w:line="240" w:before="0" w:after="0"/>
-              <w:rPr>
-                <w:rFonts w:ascii="Times New Roman" w:hAnsi="Times New Roman" w:cs="Times New Roman"/>
-              </w:rPr>
-            </w:pPr>
+              <w:spacing w:lineRule="auto" w:line="240" w:before="0" w:after="0"/>
+              <w:rPr>
+                <w:rFonts w:ascii="Times New Roman" w:hAnsi="Times New Roman" w:cs="Times New Roman"/>
+              </w:rPr>
+            </w:pPr>
+            <w:r>
+              <w:rPr>
+                <w:rFonts w:ascii="Times New Roman" w:hAnsi="Times New Roman" w:cs="Times New Roman"/>
+                <w:sz w:val="18"/>
+              </w:rPr>
+              <w:t vyd:_id="vyd:mob3b53rb2im7k">МАХ</w:t>
+            </w:r>
           </w:p>
         </w:tc>
         <w:tc vyd:_id="vyd:00000000000299">
@@ -3565,6 +3763,12 @@
                 <w:rFonts w:ascii="Times New Roman" w:hAnsi="Times New Roman" w:cs="Times New Roman"/>
               </w:rPr>
             </w:pPr>
+            <w:r>
+              <w:rPr>
+                <w:rFonts w:ascii="Times New Roman" w:hAnsi="Times New Roman" w:cs="Times New Roman"/>
+              </w:rPr>
+              <w:t vyd:_id="vyd:mob3m0lkdqcctc">MAX</w:t>
+            </w:r>
           </w:p>
         </w:tc>
         <w:tc vyd:_id="vyd:00000000000291">
@@ -3587,6 +3791,9 @@
                 <w:szCs w:val="24"/>
               </w:rPr>
             </w:pPr>
+            <w:r>
+              <w:t vyd:_id="vyd:mob27afp44mxnr">Лекция в тетрадях</w:t>
+            </w:r>
           </w:p>
         </w:tc>
       </w:tr>
@@ -3680,12 +3887,18 @@
           <w:p vyd:_id="vyd:0000000000028s">
             <w:pPr>
               <w:pStyle w:val="Normal"/>
-              <w:snapToGrid w:val="0"/>
-              <w:spacing w:lineRule="auto" w:line="240" w:before="0" w:after="0"/>
-              <w:rPr>
-                <w:rFonts w:ascii="Times New Roman" w:hAnsi="Times New Roman" w:cs="Times New Roman"/>
-              </w:rPr>
-            </w:pPr>
+              <w:spacing w:lineRule="auto" w:line="240" w:before="0" w:after="0"/>
+              <w:rPr>
+                <w:rFonts w:ascii="Times New Roman" w:hAnsi="Times New Roman" w:cs="Times New Roman"/>
+              </w:rPr>
+            </w:pPr>
+            <w:r>
+              <w:rPr>
+                <w:rFonts w:ascii="Times New Roman" w:hAnsi="Times New Roman" w:cs="Times New Roman"/>
+                <w:sz w:val="18"/>
+              </w:rPr>
+              <w:t vyd:_id="vyd:mob3flz59vky0m">Выполнить упражнения</w:t>
+            </w:r>
           </w:p>
         </w:tc>
         <w:tc vyd:_id="vyd:0000000000028p">
@@ -3730,6 +3943,13 @@
                 <w:szCs w:val="24"/>
               </w:rPr>
             </w:pPr>
+            <w:r>
+              <w:rPr>
+                <w:rFonts w:ascii="Times New Roman" w:hAnsi="Times New Roman" w:cs="Times New Roman"/>
+                <w:sz w:val="24"/>
+              </w:rPr>
+              <w:t vyd:_id="vyd:mob1lwxgftreo6">Анализ литериуры</w:t>
+            </w:r>
           </w:p>
         </w:tc>
         <w:tc vyd:_id="vyd:mob166hjw7706h">
@@ -3787,6 +4007,12 @@
                 <w:rFonts w:ascii="Times New Roman" w:hAnsi="Times New Roman" w:cs="Times New Roman"/>
               </w:rPr>
             </w:pPr>
+            <w:r>
+              <w:rPr>
+                <w:rFonts w:ascii="Times New Roman" w:hAnsi="Times New Roman" w:cs="Times New Roman"/>
+              </w:rPr>
+              <w:t vyd:_id="vyd:mob3ooh4bbyech">Создание конспекта по теме</w:t>
+            </w:r>
           </w:p>
         </w:tc>
         <w:tc vyd:_id="vyd:0000000000028h">
@@ -4232,37 +4458,51 @@
           </w:tcPr>
           <w:p vyd:_id="vyd:0000000000027d">
             <w:pPr>
-              <w:snapToGrid w:val="0"/>
               <w:spacing w:after="240"/>
               <w:rPr>
-                <w:sz w:val="20"/>
-              </w:rPr>
-            </w:pPr>
-            <w:r>
-              <w:rPr>
-                <w:sz w:val="20"/>
-              </w:rPr>
-              <w:t vyd:_id="vyd:mob1w7j1pmqdst">Правовое регулирование общественных отношений в Российской Федерации.</w:t>
-            </w:r>
-          </w:p>
-          <w:p vyd:_id="vyd:mob1w7iz9ayclq">
+                <w:sz w:val="14"/>
+              </w:rPr>
+            </w:pPr>
+            <w:r>
+              <w:rPr>
+                <w:rFonts w:ascii="Times New Roman" w:hAnsi="Times New Roman" w:eastAsia="Times New Roman" w:cs="Times New Roman"/>
+                <w:sz w:val="16"/>
+                <w:b w:val="1"/>
+              </w:rPr>
+              <w:t vyd:_id="vyd:mob20sqaduots5">81-82. Тема 6.3. Общественно-политическая и культурная жизнь в стране в 60-80 гг.</w:t>
+            </w:r>
+          </w:p>
+          <w:p vyd:_id="vyd:mob20sq8ca6wc5">
             <w:pPr>
               <w:spacing w:after="240"/>
               <w:rPr>
-                <w:sz w:val="20"/>
-              </w:rPr>
-            </w:pPr>
-            <w:r>
-              <w:rPr>
-                <w:sz w:val="20"/>
-              </w:rPr>
-              <w:t vyd:_id="vyd:mob1w7iyfzmk9i">Тема 6.1. Право в системе социальных норм.</w:t>
-            </w:r>
+                <w:sz w:val="14"/>
+              </w:rPr>
+            </w:pPr>
+            <w:r>
+              <w:rPr>
+                <w:rFonts w:ascii="Times New Roman" w:hAnsi="Times New Roman" w:eastAsia="Times New Roman" w:cs="Times New Roman"/>
+                <w:sz w:val="14"/>
+                <w:b w:val="1"/>
+              </w:rPr>
+              <w:t vyd:_id="vyd:mob20sq541w3d7">Научно-технические достижения СССР</w:t>
+            </w:r>
+          </w:p>
+          <w:p vyd:_id="vyd:mob20sq2unlyrt">
+            <w:pPr>
+              <w:spacing w:after="240"/>
+              <w:rPr>
+                <w:sz w:val="10"/>
+              </w:rPr>
+            </w:pPr>
           </w:p>
           <w:p vyd:_id="vyd:mob1w7ixstvd3v">
             <w:pPr>
               <w:pStyle w:val="Normal"/>
               <w:spacing w:lineRule="auto" w:line="240" w:before="0" w:after="0"/>
+              <w:rPr>
+                <w:sz w:val="4"/>
+              </w:rPr>
             </w:pPr>
           </w:p>
         </w:tc>
@@ -4278,12 +4518,19 @@
           <w:p vyd:_id="vyd:0000000000027b">
             <w:pPr>
               <w:pStyle w:val="Normal"/>
-              <w:snapToGrid w:val="0"/>
-              <w:spacing w:lineRule="auto" w:line="240" w:before="0" w:after="0"/>
-              <w:rPr>
-                <w:rFonts w:ascii="Times New Roman" w:hAnsi="Times New Roman" w:cs="Times New Roman"/>
-              </w:rPr>
-            </w:pPr>
+              <w:spacing w:lineRule="auto" w:line="240" w:before="0" w:after="0"/>
+              <w:rPr>
+                <w:rFonts w:ascii="Times New Roman" w:hAnsi="Times New Roman" w:cs="Times New Roman"/>
+                <w:sz w:val="18"/>
+              </w:rPr>
+            </w:pPr>
+            <w:r>
+              <w:rPr>
+                <w:rFonts w:ascii="Times New Roman" w:hAnsi="Times New Roman" w:cs="Times New Roman"/>
+                <w:sz w:val="18"/>
+              </w:rPr>
+              <w:t vyd:_id="vyd:mob3h42kx4btwl">Б. Пастернак. Биография и творчество</w:t>
+            </w:r>
           </w:p>
         </w:tc>
         <w:tc vyd:_id="vyd:00000000000278">
@@ -4385,6 +4632,12 @@
                 <w:rFonts w:ascii="Times New Roman" w:hAnsi="Times New Roman" w:cs="Times New Roman"/>
               </w:rPr>
             </w:pPr>
+            <w:r>
+              <w:rPr>
+                <w:rFonts w:ascii="Times New Roman" w:hAnsi="Times New Roman" w:cs="Times New Roman"/>
+              </w:rPr>
+              <w:t vyd:_id="vyd:mob3lecm8020ww">Сущность понятия «редактирование», задачи редактирования эскизов, 3d моделей, основные способы редактирования 3 D моделей</w:t>
+            </w:r>
           </w:p>
         </w:tc>
         <w:tc vyd:_id="vyd:00000000000270">
@@ -4399,7 +4652,6 @@
           <w:p vyd:_id="vyd:00000000000271">
             <w:pPr>
               <w:pStyle w:val="Normal"/>
-              <w:snapToGrid w:val="0"/>
               <w:spacing w:lineRule="auto" w:line="240" w:before="0" w:after="0"/>
               <w:rPr>
                 <w:rFonts w:ascii="Times New Roman" w:hAnsi="Times New Roman" w:cs="Times New Roman"/>
@@ -4408,6 +4660,14 @@
                 <w:szCs w:val="24"/>
               </w:rPr>
             </w:pPr>
+            <w:r>
+              <w:rPr>
+                <w:rFonts w:ascii="Times New Roman" w:hAnsi="Times New Roman" w:cs="Times New Roman"/>
+                <w:sz w:val="24"/>
+                <w:color w:val="000000"/>
+              </w:rPr>
+              <w:t vyd:_id="vyd:mob4fqpafimov4">Решение практкоориентированных заданий</w:t>
+            </w:r>
           </w:p>
         </w:tc>
       </w:tr>
@@ -4505,12 +4765,18 @@
           <w:p vyd:_id="vyd:0000000000026r">
             <w:pPr>
               <w:pStyle w:val="Normal"/>
-              <w:snapToGrid w:val="0"/>
-              <w:spacing w:lineRule="auto" w:line="240" w:before="0" w:after="0"/>
-              <w:rPr>
-                <w:rFonts w:ascii="Times New Roman" w:hAnsi="Times New Roman" w:cs="Times New Roman"/>
-              </w:rPr>
-            </w:pPr>
+              <w:spacing w:lineRule="auto" w:line="240" w:before="0" w:after="0"/>
+              <w:rPr>
+                <w:rFonts w:ascii="Times New Roman" w:hAnsi="Times New Roman" w:cs="Times New Roman"/>
+              </w:rPr>
+            </w:pPr>
+            <w:r>
+              <w:rPr>
+                <w:rFonts w:ascii="Times New Roman" w:hAnsi="Times New Roman" w:cs="Times New Roman"/>
+                <w:sz w:val="18"/>
+              </w:rPr>
+              <w:t vyd:_id="vyd:mob3bjxho1xq3p">МАХ</w:t>
+            </w:r>
           </w:p>
         </w:tc>
         <w:tc vyd:_id="vyd:0000000000026o">
@@ -4612,6 +4878,12 @@
                 <w:rFonts w:ascii="Times New Roman" w:hAnsi="Times New Roman" w:cs="Times New Roman"/>
               </w:rPr>
             </w:pPr>
+            <w:r>
+              <w:rPr>
+                <w:rFonts w:ascii="Times New Roman" w:hAnsi="Times New Roman" w:cs="Times New Roman"/>
+              </w:rPr>
+              <w:t vyd:_id="vyd:mob3m6m6mr70tc">MAX</w:t>
+            </w:r>
           </w:p>
         </w:tc>
         <w:tc vyd:_id="vyd:0000000000026g">
@@ -4626,7 +4898,6 @@
           <w:p vyd:_id="vyd:0000000000026h">
             <w:pPr>
               <w:pStyle w:val="Normal"/>
-              <w:snapToGrid w:val="0"/>
               <w:spacing w:lineRule="auto" w:line="240" w:before="0" w:after="0"/>
               <w:rPr>
                 <w:rFonts w:ascii="Times New Roman" w:hAnsi="Times New Roman" w:cs="Times New Roman"/>
@@ -4635,6 +4906,14 @@
                 <w:szCs w:val="24"/>
               </w:rPr>
             </w:pPr>
+            <w:r>
+              <w:rPr>
+                <w:rFonts w:ascii="Times New Roman" w:hAnsi="Times New Roman" w:cs="Times New Roman"/>
+                <w:sz w:val="24"/>
+                <w:color w:val="000000"/>
+              </w:rPr>
+              <w:t vyd:_id="vyd:mob4fqpx8tp3hy">макс</w:t>
+            </w:r>
           </w:p>
         </w:tc>
       </w:tr>
@@ -4715,6 +4994,9 @@
                 <w:szCs w:val="14"/>
               </w:rPr>
             </w:pPr>
+            <w:r>
+              <w:t vyd:_id="vyd:mob1ynyy93qm8w">Прочитать и сделать конспект для пересказа</w:t>
+            </w:r>
           </w:p>
         </w:tc>
         <w:tc vyd:_id="vyd:00000000000266">
@@ -4729,12 +5011,19 @@
           <w:p vyd:_id="vyd:00000000000267">
             <w:pPr>
               <w:pStyle w:val="Normal"/>
-              <w:snapToGrid w:val="0"/>
-              <w:spacing w:lineRule="auto" w:line="240" w:before="0" w:after="0"/>
-              <w:rPr>
-                <w:rFonts w:ascii="Times New Roman" w:hAnsi="Times New Roman" w:cs="Times New Roman"/>
-              </w:rPr>
-            </w:pPr>
+              <w:spacing w:lineRule="auto" w:line="240" w:before="0" w:after="0"/>
+              <w:rPr>
+                <w:rFonts w:ascii="Times New Roman" w:hAnsi="Times New Roman" w:cs="Times New Roman"/>
+                <w:sz w:val="18"/>
+              </w:rPr>
+            </w:pPr>
+            <w:r>
+              <w:rPr>
+                <w:rFonts w:ascii="Times New Roman" w:hAnsi="Times New Roman" w:cs="Times New Roman"/>
+                <w:sz w:val="18"/>
+              </w:rPr>
+              <w:t vyd:_id="vyd:mob3hfoh2f73ik">Выуч. Наизусть стихотворение «Зимяя ночь»</w:t>
+            </w:r>
           </w:p>
         </w:tc>
         <w:tc vyd:_id="vyd:00000000000264">
@@ -4836,6 +5125,12 @@
                 <w:rFonts w:ascii="Times New Roman" w:hAnsi="Times New Roman" w:cs="Times New Roman"/>
               </w:rPr>
             </w:pPr>
+            <w:r>
+              <w:rPr>
+                <w:rFonts w:ascii="Times New Roman" w:hAnsi="Times New Roman" w:cs="Times New Roman"/>
+              </w:rPr>
+              <w:t vyd:_id="vyd:mob3otundwzwa7">Создание конспекта по теме</w:t>
+            </w:r>
           </w:p>
         </w:tc>
         <w:tc vyd:_id="vyd:0000000000025w">
@@ -5181,6 +5476,13 @@
                 <w:szCs w:val="14"/>
               </w:rPr>
             </w:pPr>
+            <w:r>
+              <w:rPr>
+                <w:rFonts w:ascii="Times New Roman" w:hAnsi="Times New Roman" w:cs="Times New Roman"/>
+                <w:sz w:val="14"/>
+              </w:rPr>
+              <w:t vyd:_id="vyd:mob30nbggdouvd">Определение производной</w:t>
+            </w:r>
           </w:p>
         </w:tc>
         <w:tc vyd:_id="vyd:00000000000250">
@@ -5417,6 +5719,13 @@
                 <w:szCs w:val="14"/>
               </w:rPr>
             </w:pPr>
+            <w:r>
+              <w:rPr>
+                <w:rFonts w:ascii="Times New Roman" w:hAnsi="Times New Roman" w:cs="Times New Roman"/>
+                <w:sz w:val="14"/>
+              </w:rPr>
+              <w:t vyd:_id="vyd:mob312z9fuoark">мах</w:t>
+            </w:r>
           </w:p>
         </w:tc>
         <w:tc vyd:_id="vyd:0000000000024g">
@@ -5653,6 +5962,13 @@
                 <w:szCs w:val="14"/>
               </w:rPr>
             </w:pPr>
+            <w:r>
+              <w:rPr>
+                <w:rFonts w:ascii="Times New Roman" w:hAnsi="Times New Roman" w:cs="Times New Roman"/>
+                <w:sz w:val="14"/>
+              </w:rPr>
+              <w:t vyd:_id="vyd:mob315vxzi7m24">Решение задач</w:t>
+            </w:r>
           </w:p>
         </w:tc>
         <w:tc vyd:_id="vyd:0000000000023w">
@@ -8110,6 +8426,13 @@
                 <w:szCs w:val="24"/>
               </w:rPr>
             </w:pPr>
+            <w:r>
+              <w:rPr>
+                <w:rFonts w:ascii="Times New Roman" w:hAnsi="Times New Roman" w:cs="Times New Roman"/>
+                <w:sz w:val="24"/>
+              </w:rPr>
+              <w:t vyd:_id="vyd:mob31tb8l7vens">Определение производной</w:t>
+            </w:r>
           </w:p>
         </w:tc>
         <w:tc vyd:_id="vyd:000000000001xo">
@@ -8248,6 +8571,14 @@
                 <w:szCs w:val="24"/>
               </w:rPr>
             </w:pPr>
+            <w:r>
+              <w:rPr>
+                <w:rFonts w:ascii="Times New Roman" w:hAnsi="Times New Roman" w:eastAsia="Times New Roman" w:cs="Times New Roman"/>
+                <w:sz w:val="24"/>
+                <w:i w:val="1"/>
+              </w:rPr>
+              <w:t vyd:_id="vyd:mob3e4qkcim2mq">Выполнение проектной работы «Создание авторских 3d моделей»</w:t>
+            </w:r>
           </w:p>
         </w:tc>
       </w:tr>
@@ -8349,6 +8680,13 @@
                 <w:szCs w:val="24"/>
               </w:rPr>
             </w:pPr>
+            <w:r>
+              <w:rPr>
+                <w:rFonts w:ascii="Times New Roman" w:hAnsi="Times New Roman" w:cs="Times New Roman"/>
+                <w:sz w:val="24"/>
+              </w:rPr>
+              <w:t vyd:_id="vyd:mob32e7wv0yh7i">мах</w:t>
+            </w:r>
           </w:p>
         </w:tc>
         <w:tc vyd:_id="vyd:000000000001x4">
@@ -8469,6 +8807,13 @@
                 <w:szCs w:val="24"/>
               </w:rPr>
             </w:pPr>
+            <w:r>
+              <w:rPr>
+                <w:rFonts w:ascii="Times New Roman" w:hAnsi="Times New Roman" w:cs="Times New Roman"/>
+                <w:sz w:val="24"/>
+              </w:rPr>
+              <w:t vyd:_id="vyd:mob3fkb5taq0ue">MAX</w:t>
+            </w:r>
           </w:p>
         </w:tc>
       </w:tr>
@@ -8570,6 +8915,13 @@
                 <w:szCs w:val="24"/>
               </w:rPr>
             </w:pPr>
+            <w:r>
+              <w:rPr>
+                <w:rFonts w:ascii="Times New Roman" w:hAnsi="Times New Roman" w:cs="Times New Roman"/>
+                <w:sz w:val="24"/>
+              </w:rPr>
+              <w:t vyd:_id="vyd:mob32ir6hy19g4">Решение задач</w:t>
+            </w:r>
           </w:p>
         </w:tc>
         <w:tc vyd:_id="vyd:000000000001wk">
@@ -8690,6 +9042,13 @@
                 <w:szCs w:val="24"/>
               </w:rPr>
             </w:pPr>
+            <w:r>
+              <w:rPr>
+                <w:rFonts w:ascii="Times New Roman" w:hAnsi="Times New Roman" w:cs="Times New Roman"/>
+                <w:sz w:val="24"/>
+              </w:rPr>
+              <w:t vyd:_id="vyd:mob3hqu2hu9kwi">Выполнение практической работы</w:t>
+            </w:r>
           </w:p>
         </w:tc>
       </w:tr>
@@ -9089,6 +9448,13 @@
                 <w:szCs w:val="24"/>
               </w:rPr>
             </w:pPr>
+            <w:r>
+              <w:rPr>
+                <w:rFonts w:ascii="Times New Roman" w:hAnsi="Times New Roman" w:cs="Times New Roman"/>
+                <w:sz w:val="24"/>
+              </w:rPr>
+              <w:t vyd:_id="vyd:mob3gd4c1lzy5a">Редактирование 3 D моделей. Создание 3 D моделей.</w:t>
+            </w:r>
           </w:p>
         </w:tc>
         <w:tc vyd:_id="vyd:000000000001v6">
@@ -9231,12 +9597,20 @@
                 <w:szCs w:val="24"/>
               </w:rPr>
             </w:pPr>
+            <w:r>
+              <w:rPr>
+                <w:rFonts w:ascii="Times New Roman" w:hAnsi="Times New Roman" w:eastAsia="Times New Roman" w:cs="Times New Roman"/>
+                <w:sz w:val="24"/>
+                <w:i w:val="1"/>
+              </w:rPr>
+              <w:t vyd:_id="vyd:mob3f0xxjrxfme">Выполнение проектной работы «Создание авторских 3d моделей»</w:t>
+            </w:r>
           </w:p>
         </w:tc>
       </w:tr>
       <w:tr vyd:_id="vyd:000000000001ub">
         <w:trPr>
-          <w:trHeight w:val="23" w:hRule="atLeast"/>
+          <w:trHeight w:val="864.025" w:hRule="atLeast"/>
         </w:trPr>
         <w:tc vyd:_id="vyd:000000000001ut">
           <w:tcPr>
@@ -9310,6 +9684,13 @@
                 <w:szCs w:val="24"/>
               </w:rPr>
             </w:pPr>
+            <w:r>
+              <w:rPr>
+                <w:rFonts w:ascii="Times New Roman" w:hAnsi="Times New Roman" w:cs="Times New Roman"/>
+                <w:sz w:val="24"/>
+              </w:rPr>
+              <w:t vyd:_id="vyd:mob3h0xcbe0lhb">MAX</w:t>
+            </w:r>
           </w:p>
         </w:tc>
         <w:tc vyd:_id="vyd:000000000001um">
@@ -9452,6 +9833,13 @@
                 <w:szCs w:val="24"/>
               </w:rPr>
             </w:pPr>
+            <w:r>
+              <w:rPr>
+                <w:rFonts w:ascii="Times New Roman" w:hAnsi="Times New Roman" w:cs="Times New Roman"/>
+                <w:sz w:val="24"/>
+              </w:rPr>
+              <w:t vyd:_id="vyd:mob3fqzwnyzkkr">MAX</w:t>
+            </w:r>
           </w:p>
         </w:tc>
       </w:tr>
@@ -9673,6 +10061,13 @@
                 <w:szCs w:val="24"/>
               </w:rPr>
             </w:pPr>
+            <w:r>
+              <w:rPr>
+                <w:rFonts w:ascii="Times New Roman" w:hAnsi="Times New Roman" w:cs="Times New Roman"/>
+                <w:sz w:val="24"/>
+              </w:rPr>
+              <w:t vyd:_id="vyd:mob3hy5cybj1ee">Выполнение практической работы</w:t>
+            </w:r>
           </w:p>
         </w:tc>
       </w:tr>
@@ -10072,6 +10467,13 @@
                 <w:szCs w:val="24"/>
               </w:rPr>
             </w:pPr>
+            <w:r>
+              <w:rPr>
+                <w:rFonts w:ascii="Times New Roman" w:hAnsi="Times New Roman" w:cs="Times New Roman"/>
+                <w:sz w:val="24"/>
+              </w:rPr>
+              <w:t vyd:_id="vyd:mob33irrlrjeqf">Геометрический и механический смысл производной</w:t>
+            </w:r>
           </w:p>
         </w:tc>
         <w:tc vyd:_id="vyd:000000000001sn">
@@ -10296,6 +10698,13 @@
                 <w:szCs w:val="24"/>
               </w:rPr>
             </w:pPr>
+            <w:r>
+              <w:rPr>
+                <w:rFonts w:ascii="Times New Roman" w:hAnsi="Times New Roman" w:cs="Times New Roman"/>
+                <w:sz w:val="24"/>
+              </w:rPr>
+              <w:t vyd:_id="vyd:mob3433ppmcm0h">мах</w:t>
+            </w:r>
           </w:p>
         </w:tc>
         <w:tc vyd:_id="vyd:000000000001s3">
@@ -10520,6 +10929,13 @@
                 <w:szCs w:val="24"/>
               </w:rPr>
             </w:pPr>
+            <w:r>
+              <w:rPr>
+                <w:rFonts w:ascii="Times New Roman" w:hAnsi="Times New Roman" w:cs="Times New Roman"/>
+                <w:sz w:val="24"/>
+              </w:rPr>
+              <w:t vyd:_id="vyd:mob347pv84lk3y">Решение задач</w:t>
+            </w:r>
           </w:p>
         </w:tc>
         <w:tc vyd:_id="vyd:000000000001rj">
@@ -11000,6 +11416,13 @@
                 <w:szCs w:val="24"/>
               </w:rPr>
             </w:pPr>
+            <w:r>
+              <w:rPr>
+                <w:rFonts w:ascii="Times New Roman" w:hAnsi="Times New Roman" w:cs="Times New Roman"/>
+                <w:sz w:val="24"/>
+              </w:rPr>
+              <w:t vyd:_id="vyd:mob1yu2taqckip">Дифференцированный зачет</w:t>
+            </w:r>
           </w:p>
         </w:tc>
         <w:tc vyd:_id="vyd:000000000001qa">
@@ -11017,11 +11440,43 @@
               <w:snapToGrid w:val="0"/>
               <w:spacing w:lineRule="auto" w:line="240" w:before="0" w:after="0"/>
               <w:rPr>
-                <w:rFonts w:ascii="Times New Roman" w:hAnsi="Times New Roman" w:cs="Times New Roman"/>
-                <w:sz w:val="24"/>
-                <w:szCs w:val="24"/>
-              </w:rPr>
-            </w:pPr>
+                <w:rFonts w:ascii="Times New Roman" w:hAnsi="Times New Roman" w:eastAsia="Times New Roman" w:cs="Times New Roman"/>
+                <w:sz w:val="20"/>
+              </w:rPr>
+            </w:pPr>
+            <w:r>
+              <w:rPr>
+                <w:rFonts w:ascii="Times New Roman" w:hAnsi="Times New Roman" w:eastAsia="Times New Roman" w:cs="Times New Roman"/>
+                <w:sz w:val="20"/>
+              </w:rPr>
+              <w:t vyd:_id="vyd:mob1xgx2rrdd3v">Постановка цели и определение задач работы над индивидуальным проектом в соответствии с содержанием</w:t>
+            </w:r>
+            <w:r>
+              <w:rPr>
+                <w:rFonts w:ascii="Times New Roman" w:hAnsi="Times New Roman" w:eastAsia="Times New Roman" w:cs="Times New Roman"/>
+                <w:sz w:val="20"/>
+              </w:rPr>
+              <w:br w:type="textWrapping" vyd:_id="vyd:mob1xj5rbyumbl"/>
+            </w:r>
+          </w:p>
+          <w:p vyd:_id="vyd:mob1xyfct8aqsk">
+            <w:pPr>
+              <w:pStyle w:val="Normal"/>
+              <w:snapToGrid w:val="0"/>
+              <w:spacing w:lineRule="auto" w:line="240" w:before="0" w:after="0"/>
+              <w:rPr>
+                <w:rFonts w:ascii="Times New Roman" w:hAnsi="Times New Roman" w:cs="Times New Roman"/>
+                <w:sz w:val="24"/>
+                <w:szCs w:val="24"/>
+              </w:rPr>
+            </w:pPr>
+            <w:r>
+              <w:rPr>
+                <w:rFonts w:ascii="Times New Roman" w:hAnsi="Times New Roman" w:eastAsia="Times New Roman" w:cs="Times New Roman"/>
+                <w:sz w:val="20"/>
+              </w:rPr>
+              <w:t vyd:_id="vyd:mob1xw1t3zhkum">Оценка и обоснование актуальности проекта. Описание и определение проблемного поля</w:t>
+            </w:r>
           </w:p>
         </w:tc>
         <w:tc vyd:_id="vyd:000000000001q8">
@@ -11225,6 +11680,13 @@
                 <w:szCs w:val="24"/>
               </w:rPr>
             </w:pPr>
+            <w:r>
+              <w:rPr>
+                <w:rFonts w:ascii="Times New Roman" w:hAnsi="Times New Roman" w:cs="Times New Roman"/>
+                <w:sz w:val="24"/>
+              </w:rPr>
+              <w:t vyd:_id="vyd:mob1zl144my8qi">мах</w:t>
+            </w:r>
           </w:p>
         </w:tc>
         <w:tc vyd:_id="vyd:000000000001pq">
@@ -11247,6 +11709,13 @@
                 <w:szCs w:val="24"/>
               </w:rPr>
             </w:pPr>
+            <w:r>
+              <w:rPr>
+                <w:rFonts w:ascii="Times New Roman" w:hAnsi="Times New Roman" w:cs="Times New Roman"/>
+                <w:sz w:val="24"/>
+              </w:rPr>
+              <w:t vyd:_id="vyd:mob1y426bws0hx">MAX</w:t>
+            </w:r>
           </w:p>
         </w:tc>
         <w:tc vyd:_id="vyd:000000000001po">
@@ -11939,6 +12408,13 @@
                 <w:szCs w:val="24"/>
               </w:rPr>
             </w:pPr>
+            <w:r>
+              <w:rPr>
+                <w:rFonts w:ascii="Times New Roman" w:hAnsi="Times New Roman" w:cs="Times New Roman"/>
+                <w:sz w:val="24"/>
+              </w:rPr>
+              <w:t vyd:_id="vyd:mob2l8nyaoc5z6">Создание 3 D моделей</w:t>
+            </w:r>
           </w:p>
         </w:tc>
         <w:tc vyd:_id="vyd:000000000001nx">
@@ -12149,6 +12625,13 @@
                 <w:szCs w:val="24"/>
               </w:rPr>
             </w:pPr>
+            <w:r>
+              <w:rPr>
+                <w:rFonts w:ascii="Times New Roman" w:hAnsi="Times New Roman" w:cs="Times New Roman"/>
+                <w:sz w:val="24"/>
+              </w:rPr>
+              <w:t vyd:_id="vyd:mob2n0kyt7gl5q">MAX</w:t>
+            </w:r>
           </w:p>
         </w:tc>
         <w:tc vyd:_id="vyd:000000000001nd">
@@ -12788,6 +13271,13 @@
                 <w:szCs w:val="24"/>
               </w:rPr>
             </w:pPr>
+            <w:r>
+              <w:rPr>
+                <w:rFonts w:ascii="Times New Roman" w:hAnsi="Times New Roman" w:cs="Times New Roman"/>
+                <w:sz w:val="24"/>
+              </w:rPr>
+              <w:t vyd:_id="vyd:mob2e10k9r8omf">Производная</w:t>
+            </w:r>
           </w:p>
         </w:tc>
         <w:tc vyd:_id="vyd:000000000001lo">
@@ -12998,6 +13488,13 @@
                 <w:szCs w:val="24"/>
               </w:rPr>
             </w:pPr>
+            <w:r>
+              <w:rPr>
+                <w:rFonts w:ascii="Times New Roman" w:hAnsi="Times New Roman" w:cs="Times New Roman"/>
+                <w:sz w:val="24"/>
+              </w:rPr>
+              <w:t vyd:_id="vyd:mob2e5j7iglyqr">MAX</w:t>
+            </w:r>
           </w:p>
         </w:tc>
         <w:tc vyd:_id="vyd:000000000001l4">
@@ -13208,6 +13705,13 @@
                 <w:szCs w:val="24"/>
               </w:rPr>
             </w:pPr>
+            <w:r>
+              <w:rPr>
+                <w:rFonts w:ascii="Times New Roman" w:hAnsi="Times New Roman" w:cs="Times New Roman"/>
+                <w:sz w:val="24"/>
+              </w:rPr>
+              <w:t vyd:_id="vyd:mob2eehnm34078" xml:space="preserve">Решение задач </w:t>
+            </w:r>
           </w:p>
         </w:tc>
         <w:tc vyd:_id="vyd:000000000001kk">
@@ -14620,7 +15124,7 @@
       </w:tr>
       <w:tr vyd:_id="vyd:000000000001gd">
         <w:trPr>
-          <w:trHeight w:val="285.035" w:hRule="atLeast"/>
+          <w:trHeight w:val="1735.387" w:hRule="atLeast"/>
         </w:trPr>
         <w:tc vyd:_id="vyd:000000000001gv">
           <w:tcPr>
@@ -14745,6 +15249,13 @@
                 <w:szCs w:val="24"/>
               </w:rPr>
             </w:pPr>
+            <w:r>
+              <w:rPr>
+                <w:rFonts w:ascii="Times New Roman" w:hAnsi="Times New Roman" w:cs="Times New Roman"/>
+                <w:sz w:val="24"/>
+              </w:rPr>
+              <w:t vyd:_id="vyd:mob3pdkvvdif3u">Панель навигации</w:t>
+            </w:r>
           </w:p>
         </w:tc>
         <w:tc vyd:_id="vyd:000000000001gk">
@@ -14772,7 +15283,7 @@
                 <w:rFonts w:ascii="Times New Roman" w:hAnsi="Times New Roman" w:cs="Times New Roman"/>
                 <w:sz w:val="24"/>
               </w:rPr>
-              <w:t vyd:_id="vyd:mob1js5pyrxs10">непре</w:t>
+              <w:t vyd:_id="vyd:mob1js5pyrxs10">Непредельные у.в (алкены,алкины,алкодиены)</w:t>
             </w:r>
           </w:p>
         </w:tc>
@@ -14850,14 +15361,14 @@
               <w:spacing w:lineRule="auto" w:line="240" w:before="0" w:after="0"/>
               <w:rPr>
                 <w:rFonts w:ascii="Times New Roman" w:hAnsi="Times New Roman" w:cs="Times New Roman"/>
-                <w:sz w:val="22"/>
-                <w:szCs w:val="24"/>
-              </w:rPr>
-            </w:pPr>
-            <w:r>
-              <w:rPr>
-                <w:rFonts w:ascii="Times New Roman" w:hAnsi="Times New Roman" w:cs="Times New Roman"/>
-                <w:sz w:val="22"/>
+                <w:sz w:val="20"/>
+                <w:szCs w:val="24"/>
+              </w:rPr>
+            </w:pPr>
+            <w:r>
+              <w:rPr>
+                <w:rFonts w:ascii="Times New Roman" w:hAnsi="Times New Roman" w:cs="Times New Roman"/>
+                <w:sz w:val="20"/>
               </w:rPr>
               <w:t vyd:_id="vyd:mob1gm364cl9ik">Политическая система и национальная политика</w:t>
             </w:r>
@@ -14869,14 +15380,14 @@
               <w:spacing w:lineRule="auto" w:line="240" w:before="0" w:after="0"/>
               <w:rPr>
                 <w:rFonts w:ascii="Times New Roman" w:hAnsi="Times New Roman" w:cs="Times New Roman"/>
-                <w:sz w:val="22"/>
-                <w:szCs w:val="24"/>
-              </w:rPr>
-            </w:pPr>
-            <w:r>
-              <w:rPr>
-                <w:rFonts w:ascii="Times New Roman" w:hAnsi="Times New Roman" w:cs="Times New Roman"/>
-                <w:sz w:val="22"/>
+                <w:sz w:val="20"/>
+                <w:szCs w:val="24"/>
+              </w:rPr>
+            </w:pPr>
+            <w:r>
+              <w:rPr>
+                <w:rFonts w:ascii="Times New Roman" w:hAnsi="Times New Roman" w:cs="Times New Roman"/>
+                <w:sz w:val="20"/>
               </w:rPr>
               <w:t vyd:_id="vyd:mob1gm2l7k5hlz">СССР в 1930-е гг.</w:t>
             </w:r>
@@ -15010,6 +15521,13 @@
                 <w:szCs w:val="24"/>
               </w:rPr>
             </w:pPr>
+            <w:r>
+              <w:rPr>
+                <w:rFonts w:ascii="Times New Roman" w:hAnsi="Times New Roman" w:cs="Times New Roman"/>
+                <w:sz w:val="24"/>
+              </w:rPr>
+              <w:t vyd:_id="vyd:mob3plesyz6198">MAX</w:t>
+            </w:r>
           </w:p>
         </w:tc>
         <w:tc vyd:_id="vyd:000000000001g0">
@@ -15032,6 +15550,13 @@
                 <w:szCs w:val="24"/>
               </w:rPr>
             </w:pPr>
+            <w:r>
+              <w:rPr>
+                <w:rFonts w:ascii="Times New Roman" w:hAnsi="Times New Roman" w:cs="Times New Roman"/>
+                <w:sz w:val="24"/>
+              </w:rPr>
+              <w:t vyd:_id="vyd:mob4i16qky9zbv">МАХ</w:t>
+            </w:r>
           </w:p>
         </w:tc>
         <w:tc vyd:_id="vyd:000000000001fy">
@@ -15101,14 +15626,14 @@
               <w:spacing w:lineRule="auto" w:line="240" w:before="0" w:after="0"/>
               <w:rPr>
                 <w:rFonts w:ascii="Times New Roman" w:hAnsi="Times New Roman" w:cs="Times New Roman"/>
-                <w:sz w:val="22"/>
-                <w:szCs w:val="24"/>
-              </w:rPr>
-            </w:pPr>
-            <w:r>
-              <w:rPr>
-                <w:rFonts w:ascii="Times New Roman" w:hAnsi="Times New Roman" w:cs="Times New Roman"/>
-                <w:sz w:val="22"/>
+                <w:sz w:val="20"/>
+                <w:szCs w:val="24"/>
+              </w:rPr>
+            </w:pPr>
+            <w:r>
+              <w:rPr>
+                <w:rFonts w:ascii="Times New Roman" w:hAnsi="Times New Roman" w:cs="Times New Roman"/>
+                <w:sz w:val="20"/>
               </w:rPr>
               <w:t vyd:_id="vyd:mob1gwhpc03e5e">Макс</w:t>
             </w:r>
@@ -15330,27 +15855,28 @@
               <w:spacing w:lineRule="auto" w:line="240" w:before="0" w:after="0"/>
               <w:rPr>
                 <w:rFonts w:ascii="Times New Roman" w:hAnsi="Times New Roman" w:cs="Times New Roman"/>
-                <w:sz w:val="22"/>
-                <w:szCs w:val="24"/>
-              </w:rPr>
-            </w:pPr>
-            <w:r>
-              <w:rPr>
-                <w:rFonts w:ascii="Times New Roman" w:hAnsi="Times New Roman" w:cs="Times New Roman"/>
-                <w:sz w:val="22"/>
-              </w:rPr>
-              <w:t vyd:_id="vyd:mob1j80mlnd9ty" xml:space="preserve">Конспект пункта 1 </w:t>
-            </w:r>
-            <w:r>
-              <w:rPr>
-                <w:rFonts w:ascii="Times New Roman" w:hAnsi="Times New Roman" w:cs="Times New Roman"/>
+                <w:sz w:val="20"/>
+                <w:szCs w:val="24"/>
+              </w:rPr>
+            </w:pPr>
+            <w:r>
+              <w:rPr>
+                <w:rFonts w:ascii="Times New Roman" w:hAnsi="Times New Roman" w:cs="Times New Roman"/>
+                <w:sz w:val="20"/>
+              </w:rPr>
+              <w:t vyd:_id="vyd:mob1j80mlnd9ty" xml:space="preserve">Конспект пункта 1 параграфа 21 учебника Мединского В.Р. 10 класс. </w:t>
+            </w:r>
+            <w:r>
+              <w:rPr>
+                <w:rFonts w:ascii="Times New Roman" w:hAnsi="Times New Roman" w:cs="Times New Roman"/>
+                <w:sz w:val="20"/>
               </w:rPr>
               <w:t vyd:_id="vyd:mob1koz27ernvu">Конституция 1936 г.</w:t>
             </w:r>
             <w:r>
               <w:rPr>
                 <w:rFonts w:ascii="Times New Roman" w:hAnsi="Times New Roman" w:cs="Times New Roman"/>
-                <w:sz w:val="22"/>
+                <w:sz w:val="20"/>
               </w:rPr>
               <w:t vyd:_id="vyd:mob1koytx6i3kz" xml:space="preserve"> </w:t>
             </w:r>
@@ -15642,7 +16168,7 @@
                 <w:sz w:val="18"/>
                 <w:szCs w:val="18"/>
               </w:rPr>
-              <w:t vyd:_id="vyd:000000000001ej">Макатова Е.И.к.25(2)</w:t>
+              <w:t vyd:_id="vyd:000000000001ej">Макатова Е.И.к.2(2)</w:t>
             </w:r>
           </w:p>
         </w:tc>
@@ -15791,10 +16317,17 @@
               <w:spacing w:lineRule="auto" w:line="240" w:before="0" w:after="0"/>
               <w:rPr>
                 <w:rFonts w:ascii="Times New Roman" w:hAnsi="Times New Roman" w:cs="Times New Roman"/>
-                <w:sz w:val="24"/>
-                <w:szCs w:val="24"/>
-              </w:rPr>
-            </w:pPr>
+                <w:sz w:val="20"/>
+                <w:szCs w:val="24"/>
+              </w:rPr>
+            </w:pPr>
+            <w:r>
+              <w:rPr>
+                <w:rFonts w:ascii="Times New Roman" w:hAnsi="Times New Roman" w:cs="Times New Roman"/>
+                <w:sz w:val="20"/>
+              </w:rPr>
+              <w:t vyd:_id="vyd:mob1mh9jcfqshl">Политическая система в послевоенные годы</w:t>
+            </w:r>
           </w:p>
         </w:tc>
         <w:tc vyd:_id="vyd:000000000001e0">
@@ -15846,6 +16379,13 @@
                 <w:szCs w:val="24"/>
               </w:rPr>
             </w:pPr>
+            <w:r>
+              <w:rPr>
+                <w:rFonts w:ascii="Times New Roman" w:hAnsi="Times New Roman" w:cs="Times New Roman"/>
+                <w:sz w:val="24"/>
+              </w:rPr>
+              <w:t vyd:_id="vyd:mob34zqacslun0" xml:space="preserve">Производная </w:t>
+            </w:r>
           </w:p>
         </w:tc>
         <w:tc vyd:_id="vyd:000000000001dw">
@@ -15868,6 +16408,13 @@
                 <w:szCs w:val="24"/>
               </w:rPr>
             </w:pPr>
+            <w:r>
+              <w:rPr>
+                <w:rFonts w:ascii="Times New Roman" w:hAnsi="Times New Roman" w:cs="Times New Roman"/>
+                <w:sz w:val="24"/>
+              </w:rPr>
+              <w:t vyd:_id="vyd:mob3avgsicap45">Написать конспект: история развития волейбола</w:t>
+            </w:r>
           </w:p>
         </w:tc>
         <w:tc vyd:_id="vyd:000000000001du">
@@ -15924,7 +16471,7 @@
       </w:tr>
       <w:tr vyd:_id="vyd:000000000001d7">
         <w:trPr>
-          <w:trHeight w:val="23" w:hRule="atLeast"/>
+          <w:trHeight w:val="222.236" w:hRule="atLeast"/>
         </w:trPr>
         <w:tc vyd:_id="vyd:000000000001dp">
           <w:tcPr>
@@ -16016,10 +16563,17 @@
               <w:spacing w:lineRule="auto" w:line="240" w:before="0" w:after="0"/>
               <w:rPr>
                 <w:rFonts w:ascii="Times New Roman" w:hAnsi="Times New Roman" w:cs="Times New Roman"/>
-                <w:sz w:val="24"/>
-                <w:szCs w:val="24"/>
-              </w:rPr>
-            </w:pPr>
+                <w:sz w:val="20"/>
+                <w:szCs w:val="24"/>
+              </w:rPr>
+            </w:pPr>
+            <w:r>
+              <w:rPr>
+                <w:rFonts w:ascii="Times New Roman" w:hAnsi="Times New Roman" w:cs="Times New Roman"/>
+                <w:sz w:val="20"/>
+              </w:rPr>
+              <w:t vyd:_id="vyd:mob1mjwosy0xwv">Макс</w:t>
+            </w:r>
           </w:p>
         </w:tc>
         <w:tc vyd:_id="vyd:000000000001dg">
@@ -16064,6 +16618,13 @@
                 <w:szCs w:val="24"/>
               </w:rPr>
             </w:pPr>
+            <w:r>
+              <w:rPr>
+                <w:rFonts w:ascii="Times New Roman" w:hAnsi="Times New Roman" w:cs="Times New Roman"/>
+                <w:sz w:val="24"/>
+              </w:rPr>
+              <w:t vyd:_id="vyd:mob35byo38y6zp">мах</w:t>
+            </w:r>
           </w:p>
         </w:tc>
         <w:tc vyd:_id="vyd:000000000001dc">
@@ -16086,6 +16647,13 @@
                 <w:szCs w:val="24"/>
               </w:rPr>
             </w:pPr>
+            <w:r>
+              <w:rPr>
+                <w:rFonts w:ascii="Times New Roman" w:hAnsi="Times New Roman" w:cs="Times New Roman"/>
+                <w:sz w:val="24"/>
+              </w:rPr>
+              <w:t vyd:_id="vyd:mob3f0v3ftt0i6" xml:space="preserve">Max  </w:t>
+            </w:r>
           </w:p>
         </w:tc>
         <w:tc vyd:_id="vyd:000000000001da">
@@ -16234,10 +16802,31 @@
               <w:spacing w:lineRule="auto" w:line="240" w:before="0" w:after="0"/>
               <w:rPr>
                 <w:rFonts w:ascii="Times New Roman" w:hAnsi="Times New Roman" w:cs="Times New Roman"/>
-                <w:sz w:val="24"/>
-                <w:szCs w:val="24"/>
-              </w:rPr>
-            </w:pPr>
+                <w:sz w:val="20"/>
+                <w:szCs w:val="24"/>
+              </w:rPr>
+            </w:pPr>
+            <w:r>
+              <w:rPr>
+                <w:rFonts w:ascii="Times New Roman" w:hAnsi="Times New Roman" w:cs="Times New Roman"/>
+                <w:sz w:val="20"/>
+              </w:rPr>
+              <w:t vyd:_id="vyd:mob1q8jsbknt5r" xml:space="preserve">Конспект пунктов 1, 3 параграфа 2 учебника Мединского В.Р. 11 класс. </w:t>
+            </w:r>
+            <w:r>
+              <w:rPr>
+                <w:rFonts w:ascii="Times New Roman" w:hAnsi="Times New Roman" w:cs="Times New Roman"/>
+                <w:sz w:val="20"/>
+              </w:rPr>
+              <w:t vyd:_id="vyd:mob1rfshpbg7rp" xml:space="preserve">Сталин и его окружение. </w:t>
+            </w:r>
+            <w:r>
+              <w:rPr>
+                <w:rFonts w:ascii="Times New Roman" w:hAnsi="Times New Roman" w:cs="Times New Roman"/>
+                <w:sz w:val="20"/>
+              </w:rPr>
+              <w:t vyd:_id="vyd:mob1qzpdp1wkoj">Послевоенные репрессии.</w:t>
+            </w:r>
           </w:p>
         </w:tc>
         <w:tc vyd:_id="vyd:000000000001cw">
@@ -16282,6 +16871,13 @@
                 <w:szCs w:val="24"/>
               </w:rPr>
             </w:pPr>
+            <w:r>
+              <w:rPr>
+                <w:rFonts w:ascii="Times New Roman" w:hAnsi="Times New Roman" w:cs="Times New Roman"/>
+                <w:sz w:val="24"/>
+              </w:rPr>
+              <w:t vyd:_id="vyd:mob35fbvvklbpm">Решение задач</w:t>
+            </w:r>
           </w:p>
         </w:tc>
         <w:tc vyd:_id="vyd:000000000001cs">
@@ -16331,7 +16927,7 @@
                 <w:rFonts w:ascii="Times New Roman" w:hAnsi="Times New Roman" w:cs="Times New Roman"/>
                 <w:sz w:val="24"/>
               </w:rPr>
-              <w:t vyd:_id="vyd:mob1n268lpmnt9">Чтение отдельных глав</w:t>
+              <w:t vyd:_id="vyd:mob1n268lpmnt9">Чтение и анализ отдельных глав</w:t>
             </w:r>
           </w:p>
         </w:tc>
@@ -16731,6 +17327,14 @@
                 <w:szCs w:val="24"/>
               </w:rPr>
             </w:pPr>
+            <w:r>
+              <w:rPr>
+                <w:rFonts w:ascii="Times New Roman" w:hAnsi="Times New Roman" w:cs="Times New Roman"/>
+                <w:sz w:val="24"/>
+                <w:color w:val="000000"/>
+              </w:rPr>
+              <w:t vyd:_id="vyd:mob4escrejma07">Решение практкоориентированных заданий</w:t>
+            </w:r>
           </w:p>
         </w:tc>
         <w:tc vyd:_id="vyd:000000000001bl">
@@ -16754,6 +17358,14 @@
                 <w:szCs w:val="24"/>
               </w:rPr>
             </w:pPr>
+            <w:r>
+              <w:rPr>
+                <w:rFonts w:ascii="Times New Roman" w:hAnsi="Times New Roman" w:cs="Times New Roman"/>
+                <w:sz w:val="24"/>
+                <w:color w:val="000000"/>
+              </w:rPr>
+              <w:t vyd:_id="vyd:mob4igamsbp9u3">Спирты - определение,классификация, номенклатура</w:t>
+            </w:r>
           </w:p>
         </w:tc>
         <w:tc vyd:_id="vyd:000000000001bj">
@@ -16776,6 +17388,13 @@
                 <w:szCs w:val="24"/>
               </w:rPr>
             </w:pPr>
+            <w:r>
+              <w:rPr>
+                <w:rFonts w:ascii="Times New Roman" w:hAnsi="Times New Roman" w:cs="Times New Roman"/>
+                <w:sz w:val="24"/>
+              </w:rPr>
+              <w:t vyd:_id="vyd:mob3bhc5uyalfp">Написать конспект: история развития волейбола</w:t>
+            </w:r>
           </w:p>
         </w:tc>
         <w:tc vyd:_id="vyd:000000000001bh">
@@ -16794,10 +17413,17 @@
               <w:spacing w:lineRule="auto" w:line="240" w:before="0" w:after="0"/>
               <w:rPr>
                 <w:rFonts w:ascii="Times New Roman" w:hAnsi="Times New Roman" w:cs="Times New Roman"/>
-                <w:sz w:val="24"/>
-                <w:szCs w:val="24"/>
-              </w:rPr>
-            </w:pPr>
+                <w:sz w:val="20"/>
+                <w:szCs w:val="24"/>
+              </w:rPr>
+            </w:pPr>
+            <w:r>
+              <w:rPr>
+                <w:rFonts w:ascii="Times New Roman" w:hAnsi="Times New Roman" w:cs="Times New Roman"/>
+                <w:sz w:val="20"/>
+              </w:rPr>
+              <w:t vyd:_id="vyd:mob21d5t1y3uwh">Внешняя политика в 1953—1964 гг.</w:t>
+            </w:r>
           </w:p>
         </w:tc>
         <w:tc vyd:_id="vyd:000000000001bf">
@@ -16842,12 +17468,26 @@
                 <w:szCs w:val="24"/>
               </w:rPr>
             </w:pPr>
+            <w:r>
+              <w:rPr>
+                <w:rFonts w:ascii="Times New Roman" w:hAnsi="Times New Roman" w:cs="Times New Roman"/>
+                <w:sz w:val="20"/>
+              </w:rPr>
+              <w:t vyd:_id="vyd:mob4p11xcv99yo">Волновые свойства света</w:t>
+            </w:r>
+            <w:r>
+              <w:rPr>
+                <w:rFonts w:ascii="Times New Roman" w:hAnsi="Times New Roman" w:cs="Times New Roman"/>
+                <w:sz w:val="24"/>
+              </w:rPr>
+              <w:t vyd:_id="vyd:mob4pn3i466204">.</w:t>
+            </w:r>
           </w:p>
         </w:tc>
       </w:tr>
       <w:tr vyd:_id="vyd:000000000001as">
         <w:trPr>
-          <w:trHeight w:val="23" w:hRule="atLeast"/>
+          <w:trHeight w:val="266.358" w:hRule="atLeast"/>
         </w:trPr>
         <w:tc vyd:_id="vyd:000000000001ba">
           <w:tcPr>
@@ -16944,6 +17584,14 @@
                 <w:szCs w:val="24"/>
               </w:rPr>
             </w:pPr>
+            <w:r>
+              <w:rPr>
+                <w:rFonts w:ascii="Times New Roman" w:hAnsi="Times New Roman" w:cs="Times New Roman"/>
+                <w:sz w:val="24"/>
+                <w:color w:val="000000"/>
+              </w:rPr>
+              <w:t vyd:_id="vyd:mob4esey6wg8ab">макс</w:t>
+            </w:r>
           </w:p>
         </w:tc>
         <w:tc vyd:_id="vyd:000000000001b1">
@@ -16967,6 +17615,14 @@
                 <w:szCs w:val="24"/>
               </w:rPr>
             </w:pPr>
+            <w:r>
+              <w:rPr>
+                <w:rFonts w:ascii="Times New Roman" w:hAnsi="Times New Roman" w:cs="Times New Roman"/>
+                <w:sz w:val="24"/>
+                <w:color w:val="000000"/>
+              </w:rPr>
+              <w:t vyd:_id="vyd:mob4luwmcfjzoa">Макс</w:t>
+            </w:r>
           </w:p>
         </w:tc>
         <w:tc vyd:_id="vyd:000000000001az">
@@ -16989,6 +17645,13 @@
                 <w:szCs w:val="24"/>
               </w:rPr>
             </w:pPr>
+            <w:r>
+              <w:rPr>
+                <w:rFonts w:ascii="Times New Roman" w:hAnsi="Times New Roman" w:cs="Times New Roman"/>
+                <w:sz w:val="24"/>
+              </w:rPr>
+              <w:t vyd:_id="vyd:mob3mshpwd0me0">Max</w:t>
+            </w:r>
           </w:p>
         </w:tc>
         <w:tc vyd:_id="vyd:000000000001ax">
@@ -17007,10 +17670,17 @@
               <w:spacing w:lineRule="auto" w:line="240" w:before="0" w:after="0"/>
               <w:rPr>
                 <w:rFonts w:ascii="Times New Roman" w:hAnsi="Times New Roman" w:cs="Times New Roman"/>
-                <w:sz w:val="24"/>
-                <w:szCs w:val="24"/>
-              </w:rPr>
-            </w:pPr>
+                <w:sz w:val="20"/>
+                <w:szCs w:val="24"/>
+              </w:rPr>
+            </w:pPr>
+            <w:r>
+              <w:rPr>
+                <w:rFonts w:ascii="Times New Roman" w:hAnsi="Times New Roman" w:cs="Times New Roman"/>
+                <w:sz w:val="20"/>
+              </w:rPr>
+              <w:t vyd:_id="vyd:mob21q8senl48n">Макс</w:t>
+            </w:r>
           </w:p>
         </w:tc>
         <w:tc vyd:_id="vyd:000000000001av">
@@ -17055,12 +17725,19 @@
                 <w:szCs w:val="24"/>
               </w:rPr>
             </w:pPr>
+            <w:r>
+              <w:rPr>
+                <w:rFonts w:ascii="Times New Roman" w:hAnsi="Times New Roman" w:cs="Times New Roman"/>
+                <w:sz w:val="24"/>
+              </w:rPr>
+              <w:t vyd:_id="vyd:mob4pwzpww2gog">Мах</w:t>
+            </w:r>
           </w:p>
         </w:tc>
       </w:tr>
       <w:tr vyd:_id="vyd:000000000001a8">
         <w:trPr>
-          <w:trHeight w:val="23" w:hRule="atLeast"/>
+          <w:trHeight w:val="2236.065" w:hRule="atLeast"/>
         </w:trPr>
         <w:tc vyd:_id="vyd:000000000001aq">
           <w:tcPr>
@@ -17216,14 +17893,51 @@
           <w:p vyd:_id="vyd:000000000001ae">
             <w:pPr>
               <w:pStyle w:val="Normal"/>
-              <w:snapToGrid w:val="0"/>
-              <w:spacing w:lineRule="auto" w:line="240" w:before="0" w:after="0"/>
-              <w:rPr>
-                <w:rFonts w:ascii="Times New Roman" w:hAnsi="Times New Roman" w:cs="Times New Roman"/>
-                <w:sz w:val="24"/>
-                <w:szCs w:val="24"/>
-              </w:rPr>
-            </w:pPr>
+              <w:spacing w:lineRule="auto" w:line="240" w:before="0" w:after="0"/>
+              <w:rPr>
+                <w:rFonts w:ascii="Times New Roman" w:hAnsi="Times New Roman" w:cs="Times New Roman"/>
+                <w:sz w:val="20"/>
+              </w:rPr>
+            </w:pPr>
+            <w:r>
+              <w:rPr>
+                <w:rFonts w:ascii="Times New Roman" w:hAnsi="Times New Roman" w:cs="Times New Roman"/>
+                <w:sz w:val="20"/>
+              </w:rPr>
+              <w:t vyd:_id="vyd:mob1zeaq9f2gc1" xml:space="preserve">Конспект пунктов 1, 3 параграфа 10 учебника Мединского В.Р. 10 класс. </w:t>
+            </w:r>
+            <w:r>
+              <w:rPr>
+                <w:rFonts w:ascii="Times New Roman" w:hAnsi="Times New Roman" w:cs="Times New Roman"/>
+                <w:sz w:val="20"/>
+              </w:rPr>
+              <w:t vyd:_id="vyd:mob23yfdo5q2c1">Новый курс советской внешней политики: от конфронтации</w:t>
+            </w:r>
+          </w:p>
+          <w:p vyd:_id="vyd:mob23yfa59mdcs">
+            <w:pPr>
+              <w:pStyle w:val="Normal"/>
+              <w:spacing w:lineRule="auto" w:line="240" w:before="0" w:after="0"/>
+              <w:rPr>
+                <w:rFonts w:ascii="Times New Roman" w:hAnsi="Times New Roman" w:cs="Times New Roman"/>
+                <w:sz w:val="20"/>
+                <w:szCs w:val="24"/>
+              </w:rPr>
+            </w:pPr>
+            <w:r>
+              <w:rPr>
+                <w:rFonts w:ascii="Times New Roman" w:hAnsi="Times New Roman" w:cs="Times New Roman"/>
+                <w:sz w:val="20"/>
+              </w:rPr>
+              <w:t vyd:_id="vyd:mob23yeqs61yvi" xml:space="preserve">к диалогу. </w:t>
+            </w:r>
+            <w:r>
+              <w:rPr>
+                <w:rFonts w:ascii="Times New Roman" w:hAnsi="Times New Roman" w:cs="Times New Roman"/>
+                <w:sz w:val="20"/>
+              </w:rPr>
+              <w:t vyd:_id="vyd:mob24qdj8223x8">СССР и мировая социалистическая система.</w:t>
+            </w:r>
           </w:p>
         </w:tc>
         <w:tc vyd:_id="vyd:000000000001ab">
@@ -17264,10 +17978,17 @@
               <w:spacing w:lineRule="auto" w:line="240" w:before="0" w:after="0"/>
               <w:rPr>
                 <w:rFonts w:ascii="Times New Roman" w:hAnsi="Times New Roman" w:cs="Times New Roman"/>
-                <w:sz w:val="24"/>
-                <w:szCs w:val="24"/>
-              </w:rPr>
-            </w:pPr>
+                <w:sz w:val="20"/>
+                <w:szCs w:val="24"/>
+              </w:rPr>
+            </w:pPr>
+            <w:r>
+              <w:rPr>
+                <w:rFonts w:ascii="Times New Roman" w:hAnsi="Times New Roman" w:cs="Times New Roman"/>
+                <w:sz w:val="20"/>
+              </w:rPr>
+              <w:t vyd:_id="vyd:mob4qkuhopymff">Конспект параграфов 19.1,19.4,19.5,19.7</w:t>
+            </w:r>
           </w:p>
         </w:tc>
       </w:tr>
@@ -17545,7 +18266,7 @@
       </w:tr>
       <w:tr vyd:_id="vyd:0000000000018x">
         <w:trPr>
-          <w:trHeight w:val="23" w:hRule="atLeast"/>
+          <w:trHeight w:val="1597.274" w:hRule="atLeast"/>
         </w:trPr>
         <w:tc vyd:_id="vyd:0000000000019f">
           <w:tcPr>
@@ -17618,6 +18339,13 @@
                 <w:szCs w:val="24"/>
               </w:rPr>
             </w:pPr>
+            <w:r>
+              <w:rPr>
+                <w:rFonts w:ascii="Times New Roman" w:hAnsi="Times New Roman" w:cs="Times New Roman"/>
+                <w:sz w:val="24"/>
+              </w:rPr>
+              <w:t vyd:_id="vyd:mob3buzoox9i2u">Написать конспект: история развития волейбола</w:t>
+            </w:r>
           </w:p>
         </w:tc>
         <w:tc vyd:_id="vyd:00000000000198">
@@ -17662,6 +18390,13 @@
                 <w:szCs w:val="24"/>
               </w:rPr>
             </w:pPr>
+            <w:r>
+              <w:rPr>
+                <w:rFonts w:ascii="Times New Roman" w:hAnsi="Times New Roman" w:cs="Times New Roman"/>
+                <w:sz w:val="24"/>
+              </w:rPr>
+              <w:t vyd:_id="vyd:mob4m8zwmo9ytm">Спирты- физические,химические свойства</w:t>
+            </w:r>
           </w:p>
         </w:tc>
         <w:tc vyd:_id="vyd:00000000000194">
@@ -17680,10 +18415,16 @@
               <w:spacing w:lineRule="auto" w:line="240" w:before="0" w:after="0"/>
               <w:rPr>
                 <w:rFonts w:ascii="Times New Roman" w:hAnsi="Times New Roman" w:cs="Times New Roman"/>
-                <w:sz w:val="24"/>
-                <w:szCs w:val="24"/>
-              </w:rPr>
-            </w:pPr>
+                <w:sz w:val="20"/>
+                <w:szCs w:val="24"/>
+              </w:rPr>
+            </w:pPr>
+            <w:r>
+              <w:rPr>
+                <w:sz w:val="20"/>
+              </w:rPr>
+              <w:t vyd:_id="vyd:mob1u0jpp7x2vu">Освобождение народов Европы. Победа СССР в Великой Отечественной войне</w:t>
+            </w:r>
           </w:p>
         </w:tc>
         <w:tc vyd:_id="vyd:00000000000192">
@@ -17702,10 +18443,17 @@
               <w:spacing w:lineRule="auto" w:line="240" w:before="0" w:after="0"/>
               <w:rPr>
                 <w:rFonts w:ascii="Times New Roman" w:hAnsi="Times New Roman" w:cs="Times New Roman"/>
-                <w:sz w:val="24"/>
-                <w:szCs w:val="24"/>
-              </w:rPr>
-            </w:pPr>
+                <w:sz w:val="20"/>
+                <w:szCs w:val="24"/>
+              </w:rPr>
+            </w:pPr>
+            <w:r>
+              <w:rPr>
+                <w:rFonts w:ascii="Times New Roman" w:hAnsi="Times New Roman" w:cs="Times New Roman"/>
+                <w:sz w:val="20"/>
+              </w:rPr>
+              <w:t vyd:_id="vyd:mob3s0lguokhz2" xml:space="preserve">Природа света. </w:t>
+            </w:r>
           </w:p>
         </w:tc>
         <w:tc vyd:_id="vyd:00000000000190">
@@ -17750,6 +18498,13 @@
                 <w:szCs w:val="24"/>
               </w:rPr>
             </w:pPr>
+            <w:r>
+              <w:rPr>
+                <w:rFonts w:ascii="Times New Roman" w:hAnsi="Times New Roman" w:cs="Times New Roman"/>
+                <w:sz w:val="24"/>
+              </w:rPr>
+              <w:t vyd:_id="vyd:mob36cq2frj3mv" xml:space="preserve">Производная </w:t>
+            </w:r>
           </w:p>
         </w:tc>
       </w:tr>
@@ -17829,6 +18584,13 @@
                 <w:szCs w:val="24"/>
               </w:rPr>
             </w:pPr>
+            <w:r>
+              <w:rPr>
+                <w:rFonts w:ascii="Times New Roman" w:hAnsi="Times New Roman" w:cs="Times New Roman"/>
+                <w:sz w:val="24"/>
+              </w:rPr>
+              <w:t vyd:_id="vyd:mob3n0pqezpl9v">Max</w:t>
+            </w:r>
           </w:p>
         </w:tc>
         <w:tc vyd:_id="vyd:0000000000018o">
@@ -17873,6 +18635,13 @@
                 <w:szCs w:val="24"/>
               </w:rPr>
             </w:pPr>
+            <w:r>
+              <w:rPr>
+                <w:rFonts w:ascii="Times New Roman" w:hAnsi="Times New Roman" w:cs="Times New Roman"/>
+                <w:sz w:val="24"/>
+              </w:rPr>
+              <w:t vyd:_id="vyd:mob4o26cirrhua">макс</w:t>
+            </w:r>
           </w:p>
         </w:tc>
         <w:tc vyd:_id="vyd:0000000000018k">
@@ -17891,10 +18660,17 @@
               <w:spacing w:lineRule="auto" w:line="240" w:before="0" w:after="0"/>
               <w:rPr>
                 <w:rFonts w:ascii="Times New Roman" w:hAnsi="Times New Roman" w:cs="Times New Roman"/>
-                <w:sz w:val="24"/>
-                <w:szCs w:val="24"/>
-              </w:rPr>
-            </w:pPr>
+                <w:sz w:val="20"/>
+                <w:szCs w:val="24"/>
+              </w:rPr>
+            </w:pPr>
+            <w:r>
+              <w:rPr>
+                <w:rFonts w:ascii="Times New Roman" w:hAnsi="Times New Roman" w:cs="Times New Roman"/>
+                <w:sz w:val="20"/>
+              </w:rPr>
+              <w:t vyd:_id="vyd:mob1ugqbbdbnew">Макс</w:t>
+            </w:r>
           </w:p>
         </w:tc>
         <w:tc vyd:_id="vyd:0000000000018i">
@@ -17917,6 +18693,13 @@
                 <w:szCs w:val="24"/>
               </w:rPr>
             </w:pPr>
+            <w:r>
+              <w:rPr>
+                <w:rFonts w:ascii="Times New Roman" w:hAnsi="Times New Roman" w:cs="Times New Roman"/>
+                <w:sz w:val="24"/>
+              </w:rPr>
+              <w:t vyd:_id="vyd:mob47gtcbl6rfd">Мах</w:t>
+            </w:r>
           </w:p>
         </w:tc>
         <w:tc vyd:_id="vyd:0000000000018g">
@@ -17961,6 +18744,13 @@
                 <w:szCs w:val="24"/>
               </w:rPr>
             </w:pPr>
+            <w:r>
+              <w:rPr>
+                <w:rFonts w:ascii="Times New Roman" w:hAnsi="Times New Roman" w:cs="Times New Roman"/>
+                <w:sz w:val="24"/>
+              </w:rPr>
+              <w:t vyd:_id="vyd:mob36lgy9weu5a">мах</w:t>
+            </w:r>
           </w:p>
         </w:tc>
       </w:tr>
@@ -18084,6 +18874,13 @@
                 <w:szCs w:val="24"/>
               </w:rPr>
             </w:pPr>
+            <w:r>
+              <w:rPr>
+                <w:rFonts w:ascii="Times New Roman" w:hAnsi="Times New Roman" w:cs="Times New Roman"/>
+                <w:sz w:val="24"/>
+              </w:rPr>
+              <w:t vyd:_id="vyd:mob4odpdeyyymz">конспект</w:t>
+            </w:r>
           </w:p>
         </w:tc>
         <w:tc vyd:_id="vyd:00000000000180">
@@ -18098,14 +18895,41 @@
           <w:p vyd:_id="vyd:00000000000181">
             <w:pPr>
               <w:pStyle w:val="Normal"/>
-              <w:snapToGrid w:val="0"/>
-              <w:spacing w:lineRule="auto" w:line="240" w:before="0" w:after="0"/>
-              <w:rPr>
-                <w:rFonts w:ascii="Times New Roman" w:hAnsi="Times New Roman" w:cs="Times New Roman"/>
-                <w:sz w:val="24"/>
-                <w:szCs w:val="24"/>
-              </w:rPr>
-            </w:pPr>
+              <w:spacing w:lineRule="auto" w:line="240" w:before="0" w:after="0"/>
+              <w:rPr>
+                <w:rFonts w:ascii="Times New Roman" w:hAnsi="Times New Roman" w:cs="Times New Roman"/>
+                <w:sz w:val="20"/>
+                <w:szCs w:val="24"/>
+              </w:rPr>
+            </w:pPr>
+            <w:r>
+              <w:rPr>
+                <w:rFonts w:ascii="Times New Roman" w:hAnsi="Times New Roman" w:cs="Times New Roman"/>
+                <w:sz w:val="20"/>
+              </w:rPr>
+              <w:t vyd:_id="vyd:mob1so4yzvtad6" xml:space="preserve">Конспект пунктов 1,6  параграфа 37-38 учебника Мединского В.Р. 10 </w:t>
+            </w:r>
+            <w:r>
+              <w:rPr>
+                <w:rFonts w:ascii="Times New Roman" w:hAnsi="Times New Roman" w:cs="Times New Roman"/>
+                <w:sz w:val="20"/>
+              </w:rPr>
+              <w:t vyd:_id="vyd:mob1ydswh4wq2k">класс.</w:t>
+            </w:r>
+            <w:r>
+              <w:rPr>
+                <w:rFonts w:ascii="Times New Roman" w:hAnsi="Times New Roman"/>
+                <w:sz w:val="20"/>
+              </w:rPr>
+              <w:t vyd:_id="vyd:mob1y6d84yrqk7" xml:space="preserve">Освободительная миссия Красной Армии в Европе. </w:t>
+            </w:r>
+            <w:r>
+              <w:rPr>
+                <w:rFonts w:ascii="Times New Roman" w:hAnsi="Times New Roman"/>
+                <w:sz w:val="20"/>
+              </w:rPr>
+              <w:t vyd:_id="vyd:mob1xj70jgma71">Ялтинская конференция.</w:t>
+            </w:r>
           </w:p>
         </w:tc>
         <w:tc vyd:_id="vyd:0000000000017y">
@@ -18124,9 +18948,22 @@
               <w:spacing w:lineRule="auto" w:line="240" w:before="0" w:after="0"/>
               <w:rPr>
                 <w:rFonts w:ascii="Times New Roman" w:hAnsi="Times New Roman" w:cs="Times New Roman"/>
-                <w:sz w:val="24"/>
-                <w:szCs w:val="24"/>
-              </w:rPr>
+                <w:sz w:val="20"/>
+                <w:szCs w:val="24"/>
+              </w:rPr>
+            </w:pPr>
+            <w:r>
+              <w:rPr>
+                <w:rFonts w:ascii="Times New Roman" w:hAnsi="Times New Roman" w:cs="Times New Roman"/>
+                <w:sz w:val="20"/>
+              </w:rPr>
+              <w:t vyd:_id="vyd:mob4b85lg8cinr">Ответить на вопросы письменно с 1-15.(Учебник физики В.Ф.Дмитриева).</w:t>
+            </w:r>
+          </w:p>
+          <w:p vyd:_id="vyd:mob4b85bdik3k1">
+            <w:pPr>
+              <w:pStyle w:val="Normal"/>
+              <w:spacing w:lineRule="auto" w:line="240" w:before="0" w:after="0"/>
             </w:pPr>
           </w:p>
         </w:tc>
@@ -18172,6 +19009,13 @@
                 <w:szCs w:val="24"/>
               </w:rPr>
             </w:pPr>
+            <w:r>
+              <w:rPr>
+                <w:rFonts w:ascii="Times New Roman" w:hAnsi="Times New Roman" w:cs="Times New Roman"/>
+                <w:sz w:val="24"/>
+              </w:rPr>
+              <w:t vyd:_id="vyd:mob36pwi5nf300">Решение задач</w:t>
+            </w:r>
           </w:p>
         </w:tc>
       </w:tr>
@@ -18468,6 +19312,13 @@
                 <w:szCs w:val="24"/>
               </w:rPr>
             </w:pPr>
+            <w:r>
+              <w:rPr>
+                <w:rFonts w:ascii="Times New Roman" w:hAnsi="Times New Roman" w:cs="Times New Roman"/>
+                <w:sz w:val="24"/>
+              </w:rPr>
+              <w:t vyd:_id="vyd:mob4er6t6pjq09">Физика атома.</w:t>
+            </w:r>
           </w:p>
         </w:tc>
         <w:tc vyd:_id="vyd:0000000000016z">
@@ -18601,7 +19452,7 @@
       </w:tr>
       <w:tr vyd:_id="vyd:00000000000164">
         <w:trPr>
-          <w:trHeight w:val="23" w:hRule="atLeast"/>
+          <w:trHeight w:val="344.264" w:hRule="atLeast"/>
         </w:trPr>
         <w:tc vyd:_id="vyd:0000000000016m">
           <w:tcPr>
@@ -18676,6 +19527,13 @@
                 <w:szCs w:val="24"/>
               </w:rPr>
             </w:pPr>
+            <w:r>
+              <w:rPr>
+                <w:rFonts w:ascii="Times New Roman" w:hAnsi="Times New Roman" w:cs="Times New Roman"/>
+                <w:sz w:val="24"/>
+              </w:rPr>
+              <w:t vyd:_id="vyd:mob4f4rwtm9555">Мах</w:t>
+            </w:r>
           </w:p>
         </w:tc>
         <w:tc vyd:_id="vyd:0000000000016f">
@@ -18876,14 +19734,20 @@
           <w:p vyd:_id="vyd:0000000000015y">
             <w:pPr>
               <w:pStyle w:val="Normal"/>
-              <w:snapToGrid w:val="0"/>
-              <w:spacing w:lineRule="auto" w:line="240" w:before="0" w:after="0"/>
-              <w:rPr>
-                <w:rFonts w:ascii="Times New Roman" w:hAnsi="Times New Roman" w:cs="Times New Roman"/>
-                <w:sz w:val="24"/>
-                <w:szCs w:val="24"/>
-              </w:rPr>
-            </w:pPr>
+              <w:spacing w:lineRule="auto" w:line="240" w:before="0" w:after="0"/>
+              <w:rPr>
+                <w:rFonts w:ascii="Times New Roman" w:hAnsi="Times New Roman" w:cs="Times New Roman"/>
+                <w:sz w:val="24"/>
+                <w:szCs w:val="24"/>
+              </w:rPr>
+            </w:pPr>
+            <w:r>
+              <w:rPr>
+                <w:rFonts w:ascii="Times New Roman" w:hAnsi="Times New Roman" w:cs="Times New Roman"/>
+                <w:sz w:val="20"/>
+              </w:rPr>
+              <w:t vyd:_id="vyd:mob4fmtbcgwef8">Ответить на вопросы письменно № 1,4,7,8.(Учебник физики В.Ф.Дмитриева).</w:t>
+            </w:r>
           </w:p>
         </w:tc>
         <w:tc vyd:_id="vyd:0000000000015v">
@@ -19309,6 +20173,13 @@
                 <w:szCs w:val="24"/>
               </w:rPr>
             </w:pPr>
+            <w:r>
+              <w:rPr>
+                <w:rFonts w:ascii="Times New Roman" w:hAnsi="Times New Roman" w:cs="Times New Roman"/>
+                <w:sz w:val="24"/>
+              </w:rPr>
+              <w:t vyd:_id="vyd:mob37ba1hlqqfv" xml:space="preserve">Производная </w:t>
+            </w:r>
           </w:p>
         </w:tc>
         <w:tc vyd:_id="vyd:0000000000014q">
@@ -19442,7 +20313,7 @@
       </w:tr>
       <w:tr vyd:_id="vyd:0000000000013v">
         <w:trPr>
-          <w:trHeight w:val="23" w:hRule="atLeast"/>
+          <w:trHeight w:val="294.126" w:hRule="atLeast"/>
         </w:trPr>
         <w:tc vyd:_id="vyd:0000000000014d">
           <w:tcPr>
@@ -19518,6 +20389,13 @@
                 <w:szCs w:val="24"/>
               </w:rPr>
             </w:pPr>
+            <w:r>
+              <w:rPr>
+                <w:rFonts w:ascii="Times New Roman" w:hAnsi="Times New Roman" w:cs="Times New Roman"/>
+                <w:sz w:val="24"/>
+              </w:rPr>
+              <w:t vyd:_id="vyd:mob37modmokirn">мах</w:t>
+            </w:r>
           </w:p>
         </w:tc>
         <w:tc vyd:_id="vyd:00000000000146">
@@ -19727,6 +20605,13 @@
                 <w:szCs w:val="24"/>
               </w:rPr>
             </w:pPr>
+            <w:r>
+              <w:rPr>
+                <w:rFonts w:ascii="Times New Roman" w:hAnsi="Times New Roman" w:cs="Times New Roman"/>
+                <w:sz w:val="24"/>
+              </w:rPr>
+              <w:t vyd:_id="vyd:mob37phzrn0gr3">Решение задач</w:t>
+            </w:r>
           </w:p>
         </w:tc>
         <w:tc vyd:_id="vyd:0000000000013m">
@@ -20365,7 +21250,6 @@
     </w:p>
     <w:tbl vyd:_id="vyd:000000000000rs">
       <w:tblPr>
-        <w:tblW w:w="13391" w:type="dxa"/>
         <w:jc w:val="center"/>
         <w:tblInd w:w="0" w:type="dxa"/>
         <w:tblLayout w:type="fixed"/>
@@ -20378,8 +21262,8 @@
       </w:tblPr>
       <w:tblGrid>
         <w:gridCol w:w="620"/>
-        <w:gridCol w:w="867"/>
-        <w:gridCol w:w="1984"/>
+        <w:gridCol w:w="900.5"/>
+        <w:gridCol w:w="1950.5"/>
         <w:gridCol w:w="1984"/>
         <w:gridCol w:w="1984"/>
         <w:gridCol w:w="1984"/>
@@ -20886,7 +21770,7 @@
       </w:tr>
       <w:tr vyd:_id="vyd:000000000000zv">
         <w:trPr>
-          <w:trHeight w:val="1320.07" w:hRule="atLeast"/>
+          <w:trHeight w:val="1445.11" w:hRule="atLeast"/>
         </w:trPr>
         <w:tc vyd:_id="vyd:0000000000010l">
           <w:tcPr>
@@ -21233,130 +22117,6 @@
         <w:tc vyd:_id="vyd:000000000000zo">
           <w:tcPr>
             <w:tcBorders>
-              <w:top w:val="single" w:color="000000" w:sz="4" w:space="0"/>
-              <w:start w:val="single" w:color="000000" w:sz="4" w:space="0"/>
-              <w:bottom w:val="single" w:color="000000" w:sz="4" w:space="0"/>
-              <w:end w:val="single" w:color="000000" w:sz="4" w:space="0"/>
-            </w:tcBorders>
-          </w:tcPr>
-          <w:p vyd:_id="vyd:000000000000zp">
-            <w:pPr>
-              <w:pStyle w:val="Normal"/>
-              <w:snapToGrid w:val="0"/>
-              <w:spacing w:lineRule="auto" w:line="240" w:before="0" w:after="0"/>
-              <w:rPr>
-                <w:rFonts w:ascii="Times New Roman" w:hAnsi="Times New Roman" w:cs="Times New Roman"/>
-                <w:sz w:val="18"/>
-                <w:szCs w:val="18"/>
-              </w:rPr>
-            </w:pPr>
-          </w:p>
-        </w:tc>
-        <w:tc vyd:_id="vyd:000000000000zm">
-          <w:tcPr>
-            <w:tcBorders>
-              <w:top w:val="single" w:color="000000" w:sz="4" w:space="0"/>
-              <w:start w:val="single" w:color="000000" w:sz="4" w:space="0"/>
-              <w:bottom w:val="single" w:color="000000" w:sz="4" w:space="0"/>
-              <w:end w:val="single" w:color="000000" w:sz="4" w:space="0"/>
-            </w:tcBorders>
-          </w:tcPr>
-          <w:p vyd:_id="vyd:000000000000zn">
-            <w:pPr>
-              <w:pStyle w:val="Normal"/>
-              <w:snapToGrid w:val="0"/>
-              <w:spacing w:lineRule="auto" w:line="240" w:before="0" w:after="0"/>
-              <w:rPr>
-                <w:rFonts w:ascii="Times New Roman" w:hAnsi="Times New Roman" w:cs="Times New Roman"/>
-                <w:sz w:val="18"/>
-                <w:szCs w:val="18"/>
-              </w:rPr>
-            </w:pPr>
-          </w:p>
-        </w:tc>
-        <w:tc vyd:_id="vyd:000000000000zk">
-          <w:tcPr>
-            <w:tcBorders>
-              <w:top w:val="single" w:color="000000" w:sz="4" w:space="0"/>
-              <w:start w:val="single" w:color="000000" w:sz="4" w:space="0"/>
-              <w:bottom w:val="single" w:color="000000" w:sz="4" w:space="0"/>
-              <w:end w:val="single" w:color="000000" w:sz="4" w:space="0"/>
-            </w:tcBorders>
-          </w:tcPr>
-          <w:p vyd:_id="vyd:000000000000zl">
-            <w:pPr>
-              <w:pStyle w:val="Normal"/>
-              <w:snapToGrid w:val="0"/>
-              <w:spacing w:lineRule="auto" w:line="240" w:before="0" w:after="0"/>
-              <w:rPr>
-                <w:rFonts w:ascii="Times New Roman" w:hAnsi="Times New Roman" w:cs="Times New Roman"/>
-                <w:sz w:val="18"/>
-                <w:szCs w:val="18"/>
-              </w:rPr>
-            </w:pPr>
-            <w:r>
-              <w:rPr>
-                <w:rFonts w:ascii="Times New Roman" w:hAnsi="Times New Roman" w:cs="Times New Roman"/>
-                <w:sz w:val="18"/>
-              </w:rPr>
-              <w:t vyd:_id="vyd:mob1jgwwvt34kg">Повтоотить темк « Глаголы в Prese</w:t>
-            </w:r>
-          </w:p>
-        </w:tc>
-        <w:tc vyd:_id="vyd:000000000000zi">
-          <w:tcPr>
-            <w:tcBorders>
-              <w:top w:val="single" w:color="000000" w:sz="4" w:space="0"/>
-              <w:start w:val="single" w:color="000000" w:sz="4" w:space="0"/>
-              <w:bottom w:val="single" w:color="000000" w:sz="4" w:space="0"/>
-              <w:end w:val="single" w:color="000000" w:sz="4" w:space="0"/>
-            </w:tcBorders>
-          </w:tcPr>
-          <w:p vyd:_id="vyd:000000000000zj">
-            <w:pPr>
-              <w:pStyle w:val="Normal"/>
-              <w:snapToGrid w:val="0"/>
-              <w:spacing w:lineRule="auto" w:line="240" w:before="0" w:after="0"/>
-              <w:rPr>
-                <w:rFonts w:ascii="Times New Roman" w:hAnsi="Times New Roman" w:cs="Times New Roman"/>
-                <w:sz w:val="18"/>
-                <w:szCs w:val="18"/>
-              </w:rPr>
-            </w:pPr>
-          </w:p>
-        </w:tc>
-        <w:tc vyd:_id="vyd:000000000000zg">
-          <w:tcPr>
-            <w:tcBorders>
-              <w:top w:val="single" w:color="000000" w:sz="4" w:space="0"/>
-              <w:start w:val="single" w:color="000000" w:sz="4" w:space="0"/>
-              <w:bottom w:val="single" w:color="000000" w:sz="4" w:space="0"/>
-              <w:end w:val="single" w:color="000000" w:sz="4" w:space="0"/>
-            </w:tcBorders>
-          </w:tcPr>
-          <w:p vyd:_id="vyd:000000000000zh">
-            <w:pPr>
-              <w:pStyle w:val="Normal"/>
-              <w:snapToGrid w:val="0"/>
-              <w:spacing w:lineRule="auto" w:line="240" w:before="0" w:after="0"/>
-              <w:rPr>
-                <w:rFonts w:ascii="Times New Roman" w:hAnsi="Times New Roman" w:cs="Times New Roman"/>
-                <w:sz w:val="18"/>
-                <w:szCs w:val="18"/>
-              </w:rPr>
-            </w:pPr>
-            <w:r>
-              <w:rPr>
-                <w:rFonts w:ascii="Times New Roman" w:hAnsi="Times New Roman" w:cs="Times New Roman"/>
-                <w:sz w:val="18"/>
-              </w:rPr>
-              <w:t vyd:_id="vyd:mob1eseoyxaezo">Т.О.</w:t>
-            </w:r>
-          </w:p>
-        </w:tc>
-        <w:tc vyd:_id="vyd:000000000000ze">
-          <w:tcPr>
-            <w:tcBorders>
               <w:top w:val="single" w:sz="8"/>
               <w:start w:val="single" w:sz="8"/>
               <w:bottom w:val="single" w:sz="8"/>
@@ -21369,6 +22129,153 @@
               <w:end w:w="108" w:type="dxa"/>
             </w:tcMar>
           </w:tcPr>
+          <w:p vyd:_id="vyd:000000000000zp">
+            <w:pPr>
+              <w:spacing w:after="0"/>
+              <w:rPr>
+                <w:rFonts w:ascii="Times New Roman" w:hAnsi="Times New Roman" w:cs="Times New Roman"/>
+                <w:sz w:val="18"/>
+                <w:szCs w:val="18"/>
+              </w:rPr>
+            </w:pPr>
+            <w:r>
+              <w:rPr>
+                <w:sz w:val="22"/>
+              </w:rPr>
+              <w:t vyd:_id="vyd:mob38nabxcsa8x">Учет прочих доходов</w:t>
+            </w:r>
+            <w:r>
+              <w:rPr>
+                <w:sz w:val="22"/>
+              </w:rPr>
+              <w:t vyd:_id="vyd:mob38khv6y8jna">Учет прочих расходов.</w:t>
+            </w:r>
+          </w:p>
+        </w:tc>
+        <w:tc vyd:_id="vyd:000000000000zm">
+          <w:tcPr>
+            <w:tcBorders>
+              <w:top w:val="single" w:color="000000" w:sz="4" w:space="0"/>
+              <w:start w:val="single" w:color="000000" w:sz="4" w:space="0"/>
+              <w:bottom w:val="single" w:color="000000" w:sz="4" w:space="0"/>
+              <w:end w:val="single" w:color="000000" w:sz="4" w:space="0"/>
+            </w:tcBorders>
+          </w:tcPr>
+          <w:p vyd:_id="vyd:000000000000zn">
+            <w:pPr>
+              <w:pStyle w:val="Normal"/>
+              <w:snapToGrid w:val="0"/>
+              <w:spacing w:lineRule="auto" w:line="240" w:before="0" w:after="0"/>
+              <w:rPr>
+                <w:rFonts w:ascii="Times New Roman" w:hAnsi="Times New Roman" w:cs="Times New Roman"/>
+                <w:sz w:val="18"/>
+                <w:szCs w:val="18"/>
+              </w:rPr>
+            </w:pPr>
+          </w:p>
+        </w:tc>
+        <w:tc vyd:_id="vyd:000000000000zk">
+          <w:tcPr>
+            <w:tcBorders>
+              <w:top w:val="single" w:color="000000" w:sz="4" w:space="0"/>
+              <w:start w:val="single" w:color="000000" w:sz="4" w:space="0"/>
+              <w:bottom w:val="single" w:color="000000" w:sz="4" w:space="0"/>
+              <w:end w:val="single" w:color="000000" w:sz="4" w:space="0"/>
+            </w:tcBorders>
+          </w:tcPr>
+          <w:p vyd:_id="vyd:000000000000zl">
+            <w:pPr>
+              <w:pStyle w:val="Normal"/>
+              <w:snapToGrid w:val="0"/>
+              <w:spacing w:lineRule="auto" w:line="240" w:before="0" w:after="0"/>
+              <w:rPr>
+                <w:rFonts w:ascii="Times New Roman" w:hAnsi="Times New Roman" w:cs="Times New Roman"/>
+                <w:sz w:val="18"/>
+                <w:szCs w:val="18"/>
+              </w:rPr>
+            </w:pPr>
+            <w:r>
+              <w:rPr>
+                <w:rFonts w:ascii="Times New Roman" w:hAnsi="Times New Roman" w:cs="Times New Roman"/>
+                <w:sz w:val="18"/>
+              </w:rPr>
+              <w:t vyd:_id="vyd:mob1jgwwvt34kg">Повтоотить темк « Глаголы в Present Simple»</w:t>
+            </w:r>
+          </w:p>
+        </w:tc>
+        <w:tc vyd:_id="vyd:000000000000zi">
+          <w:tcPr>
+            <w:tcBorders>
+              <w:top w:val="single" w:color="000000" w:sz="4" w:space="0"/>
+              <w:start w:val="single" w:color="000000" w:sz="4" w:space="0"/>
+              <w:bottom w:val="single" w:color="000000" w:sz="4" w:space="0"/>
+              <w:end w:val="single" w:color="000000" w:sz="4" w:space="0"/>
+            </w:tcBorders>
+          </w:tcPr>
+          <w:p vyd:_id="vyd:000000000000zj">
+            <w:pPr>
+              <w:pStyle w:val="Normal"/>
+              <w:snapToGrid w:val="0"/>
+              <w:spacing w:lineRule="auto" w:line="240" w:before="0" w:after="0"/>
+              <w:rPr>
+                <w:rFonts w:ascii="Times New Roman" w:hAnsi="Times New Roman" w:cs="Times New Roman"/>
+                <w:sz w:val="18"/>
+                <w:szCs w:val="18"/>
+              </w:rPr>
+            </w:pPr>
+            <w:r>
+              <w:rPr>
+                <w:rFonts w:ascii="Times New Roman" w:hAnsi="Times New Roman" w:cs="Times New Roman"/>
+                <w:sz w:val="18"/>
+              </w:rPr>
+              <w:t vyd:_id="vyd:mob1rkhulbvmr4">Решение кейсов по теме «Психология групп»</w:t>
+            </w:r>
+          </w:p>
+        </w:tc>
+        <w:tc vyd:_id="vyd:000000000000zg">
+          <w:tcPr>
+            <w:tcBorders>
+              <w:top w:val="single" w:color="000000" w:sz="4" w:space="0"/>
+              <w:start w:val="single" w:color="000000" w:sz="4" w:space="0"/>
+              <w:bottom w:val="single" w:color="000000" w:sz="4" w:space="0"/>
+              <w:end w:val="single" w:color="000000" w:sz="4" w:space="0"/>
+            </w:tcBorders>
+          </w:tcPr>
+          <w:p vyd:_id="vyd:000000000000zh">
+            <w:pPr>
+              <w:pStyle w:val="Normal"/>
+              <w:snapToGrid w:val="0"/>
+              <w:spacing w:lineRule="auto" w:line="240" w:before="0" w:after="0"/>
+              <w:rPr>
+                <w:rFonts w:ascii="Times New Roman" w:hAnsi="Times New Roman" w:cs="Times New Roman"/>
+                <w:sz w:val="18"/>
+                <w:szCs w:val="18"/>
+              </w:rPr>
+            </w:pPr>
+            <w:r>
+              <w:rPr>
+                <w:rFonts w:ascii="Times New Roman" w:hAnsi="Times New Roman" w:cs="Times New Roman"/>
+                <w:sz w:val="18"/>
+              </w:rPr>
+              <w:t vyd:_id="vyd:mob1eseoyxaezo">Т.О.</w:t>
+            </w:r>
+          </w:p>
+        </w:tc>
+        <w:tc vyd:_id="vyd:000000000000ze">
+          <w:tcPr>
+            <w:tcBorders>
+              <w:top w:val="single" w:sz="8"/>
+              <w:start w:val="single" w:sz="8"/>
+              <w:bottom w:val="single" w:sz="8"/>
+              <w:end w:val="single" w:sz="8"/>
+            </w:tcBorders>
+            <w:tcMar>
+              <w:top w:w="0" w:type="dxa"/>
+              <w:start w:w="108" w:type="dxa"/>
+              <w:bottom w:w="0" w:type="dxa"/>
+              <w:end w:w="108" w:type="dxa"/>
+            </w:tcMar>
+          </w:tcPr>
           <w:p vyd:_id="vyd:000000000000zf">
             <w:pPr>
               <w:snapToGrid w:val="0"/>
@@ -21461,6 +22368,13 @@
                 <w:szCs w:val="18"/>
               </w:rPr>
             </w:pPr>
+            <w:r>
+              <w:rPr>
+                <w:rFonts w:ascii="Times New Roman" w:hAnsi="Times New Roman" w:cs="Times New Roman"/>
+                <w:sz w:val="18"/>
+              </w:rPr>
+              <w:t vyd:_id="vyd:mob3z541jsqdur">макс</w:t>
+            </w:r>
           </w:p>
         </w:tc>
         <w:tc vyd:_id="vyd:000000000000z4">
@@ -21527,6 +22441,33 @@
                 <w:szCs w:val="18"/>
               </w:rPr>
             </w:pPr>
+            <w:r>
+              <w:fldChar w:fldCharType="begin" vyd:_id="vyd:mob247tuiuv51l"/>
+            </w:r>
+            <w:r>
+              <w:instrText>HYPERLINK "https://max.ru/joincall/cYnZRm2CFbj0iBb2kP2h4-ygtfFzxkasDhuymJQn-30"</w:instrText>
+            </w:r>
+            <w:r>
+              <w:fldChar w:fldCharType="separate"/>
+            </w:r>
+            <w:r>
+              <w:rPr>
+                <w:rStyle w:val="Hyperlink"/>
+                <w:rFonts w:ascii="Times New Roman" w:hAnsi="Times New Roman" w:cs="Times New Roman"/>
+                <w:sz w:val="18"/>
+              </w:rPr>
+              <w:t vyd:_id="vyd:mob1udltu1s4em">https://max.ru/joincall/cYnZRm2CFbj0iBb2kP2h4-ygtfFzxkasDhuymJQn-30</w:t>
+            </w:r>
+            <w:r>
+              <w:fldChar w:fldCharType="end" vyd:_id="vyd:mob247tuiuv51l-end"/>
+            </w:r>
+            <w:r>
+              <w:rPr>
+                <w:rFonts w:ascii="Times New Roman" w:hAnsi="Times New Roman" w:cs="Times New Roman"/>
+                <w:sz w:val="18"/>
+              </w:rPr>
+              <w:t vyd:_id="vyd:mob247tufjy1qp" xml:space="preserve"> </w:t>
+            </w:r>
           </w:p>
         </w:tc>
         <w:tc vyd:_id="vyd:000000000000yy">
@@ -21578,6 +22519,12 @@
                 <w:szCs w:val="18"/>
               </w:rPr>
             </w:pPr>
+            <w:r>
+              <w:rPr>
+                <w:sz w:val="18"/>
+              </w:rPr>
+              <w:t vyd:_id="vyd:mob3w9quc0vy8s">Макс</w:t>
+            </w:r>
           </w:p>
         </w:tc>
       </w:tr>
@@ -21657,6 +22604,13 @@
                 <w:szCs w:val="18"/>
               </w:rPr>
             </w:pPr>
+            <w:r>
+              <w:rPr>
+                <w:rFonts w:ascii="Times New Roman" w:hAnsi="Times New Roman" w:cs="Times New Roman"/>
+                <w:sz w:val="18"/>
+              </w:rPr>
+              <w:t vyd:_id="vyd:mob3z7xxsoui44">конспект</w:t>
+            </w:r>
           </w:p>
         </w:tc>
         <w:tc vyd:_id="vyd:000000000000ym">
@@ -21757,6 +22711,22 @@
             </w:tcBorders>
           </w:tcPr>
           <w:p vyd:_id="vyd:000000000000yf">
+            <w:pPr>
+              <w:spacing w:after="0" w:lineRule="auto" w:line="240" w:before="0"/>
+              <w:rPr>
+                <w:rFonts w:ascii="Calibri" w:hAnsi="Calibri" w:eastAsia="Calibri" w:cs="Calibri"/>
+                <w:sz w:val="22"/>
+              </w:rPr>
+            </w:pPr>
+            <w:r>
+              <w:rPr>
+                <w:rFonts w:ascii="Times New Roman" w:hAnsi="Times New Roman" w:eastAsia="Times New Roman" w:cs="Times New Roman"/>
+                <w:sz w:val="18"/>
+              </w:rPr>
+              <w:t vyd:_id="vyd:mob3vjxoxs972b">Подготовить отчёт</w:t>
+            </w:r>
+          </w:p>
+          <w:p vyd:_id="vyd:mob3vjxb61q8ht">
             <w:pPr>
               <w:pStyle w:val="Normal"/>
               <w:snapToGrid w:val="0"/>
@@ -22076,6 +23046,13 @@
                 <w:szCs w:val="18"/>
               </w:rPr>
             </w:pPr>
+            <w:r>
+              <w:rPr>
+                <w:rFonts w:ascii="Times New Roman" w:hAnsi="Times New Roman" w:cs="Times New Roman"/>
+                <w:sz w:val="18"/>
+              </w:rPr>
+              <w:t vyd:_id="vyd:mob3zgp8gprkbb">Порядок составления сличительных ведомостей</w:t>
+            </w:r>
           </w:p>
         </w:tc>
         <w:tc vyd:_id="vyd:000000000000xh">
@@ -22287,6 +23264,13 @@
                 <w:szCs w:val="18"/>
               </w:rPr>
             </w:pPr>
+            <w:r>
+              <w:rPr>
+                <w:rFonts w:ascii="Times New Roman" w:hAnsi="Times New Roman" w:cs="Times New Roman"/>
+                <w:sz w:val="18"/>
+              </w:rPr>
+              <w:t vyd:_id="vyd:mob404bg3cc42s">макс</w:t>
+            </w:r>
           </w:p>
         </w:tc>
         <w:tc vyd:_id="vyd:000000000000wz">
@@ -22404,6 +23388,12 @@
                 <w:szCs w:val="18"/>
               </w:rPr>
             </w:pPr>
+            <w:r>
+              <w:rPr>
+                <w:sz w:val="18"/>
+              </w:rPr>
+              <w:t vyd:_id="vyd:mob3wf0kpqz2hf">Макс</w:t>
+            </w:r>
           </w:p>
         </w:tc>
       </w:tr>
@@ -22483,6 +23473,13 @@
                 <w:szCs w:val="18"/>
               </w:rPr>
             </w:pPr>
+            <w:r>
+              <w:rPr>
+                <w:rFonts w:ascii="Times New Roman" w:hAnsi="Times New Roman" w:cs="Times New Roman"/>
+                <w:sz w:val="18"/>
+              </w:rPr>
+              <w:t vyd:_id="vyd:mob4076vg2make">конспект</w:t>
+            </w:r>
           </w:p>
         </w:tc>
         <w:tc vyd:_id="vyd:000000000000wh">
@@ -22605,7 +23602,7 @@
                 <w:rFonts w:ascii="Times New Roman" w:hAnsi="Times New Roman" w:cs="Times New Roman"/>
                 <w:sz w:val="18"/>
               </w:rPr>
-              <w:t vyd:_id="vyd:mob3uojauvx0z5">П</w:t>
+              <w:t vyd:_id="vyd:mob3uojauvx0z5">Подготовить отчёт</w:t>
             </w:r>
           </w:p>
         </w:tc>
@@ -22915,7 +23912,7 @@
       </w:tr>
       <w:tr vyd:_id="vyd:000000000000uw">
         <w:trPr>
-          <w:trHeight w:val="357.429" w:hRule="atLeast"/>
+          <w:trHeight w:val="2135.402" w:hRule="atLeast"/>
         </w:trPr>
         <w:tc vyd:_id="vyd:000000000000vc">
           <w:tcPr>
@@ -22990,6 +23987,14 @@
                 <w:szCs w:val="18"/>
               </w:rPr>
             </w:pPr>
+            <w:r>
+              <w:rPr>
+                <w:rFonts w:ascii="Times New Roman" w:hAnsi="Times New Roman" w:cs="Times New Roman"/>
+                <w:sz w:val="18"/>
+                <w:color w:val="000000"/>
+              </w:rPr>
+              <w:t vyd:_id="vyd:mob2af2ds09ct2">Перемены в духовной сфере в годы перестройки</w:t>
+            </w:r>
           </w:p>
         </w:tc>
         <w:tc vyd:_id="vyd:000000000000v5">
@@ -23043,6 +24048,13 @@
                 <w:szCs w:val="18"/>
               </w:rPr>
             </w:pPr>
+            <w:r>
+              <w:rPr>
+                <w:rFonts w:ascii="Times New Roman" w:hAnsi="Times New Roman" w:eastAsia="Times New Roman" w:cs="Times New Roman"/>
+                <w:sz w:val="20"/>
+              </w:rPr>
+              <w:t vyd:_id="vyd:mob1vxcpe1d621">Групповые процессы. Социально-психологический климат группы. Психологические основы деятельности коллектива</w:t>
+            </w:r>
           </w:p>
         </w:tc>
         <w:tc vyd:_id="vyd:000000000000v1">
@@ -23203,6 +24215,14 @@
                 <w:szCs w:val="18"/>
               </w:rPr>
             </w:pPr>
+            <w:r>
+              <w:rPr>
+                <w:rFonts w:ascii="Times New Roman" w:hAnsi="Times New Roman" w:cs="Times New Roman"/>
+                <w:sz w:val="18"/>
+                <w:color w:val="000000"/>
+              </w:rPr>
+              <w:t vyd:_id="vyd:mob2b41ph7yzvg">макс</w:t>
+            </w:r>
           </w:p>
         </w:tc>
         <w:tc vyd:_id="vyd:000000000000un">
@@ -23256,6 +24276,33 @@
                 <w:szCs w:val="18"/>
               </w:rPr>
             </w:pPr>
+            <w:r>
+              <w:fldChar w:fldCharType="begin" vyd:_id="vyd:mob23xylyt4frb"/>
+            </w:r>
+            <w:r>
+              <w:instrText>HYPERLINK "https://max.ru/joincall/0U1kh8z39AIttXpvG-B7nhNn6MB0yNPzjIxZvQnGjGI"</w:instrText>
+            </w:r>
+            <w:r>
+              <w:fldChar w:fldCharType="separate"/>
+            </w:r>
+            <w:r>
+              <w:rPr>
+                <w:rStyle w:val="Hyperlink"/>
+                <w:rFonts w:ascii="Times New Roman" w:hAnsi="Times New Roman" w:cs="Times New Roman"/>
+                <w:sz w:val="18"/>
+              </w:rPr>
+              <w:t vyd:_id="vyd:mob2218egqptt7">https://max.ru/joincall/0U1kh8z39AIttXpvG-B7nhNn6MB0yNPzjIxZvQnGjGI</w:t>
+            </w:r>
+            <w:r>
+              <w:fldChar w:fldCharType="end" vyd:_id="vyd:mob23xylyt4frb-end"/>
+            </w:r>
+            <w:r>
+              <w:rPr>
+                <w:rFonts w:ascii="Times New Roman" w:hAnsi="Times New Roman" w:cs="Times New Roman"/>
+                <w:sz w:val="18"/>
+              </w:rPr>
+              <w:t vyd:_id="vyd:mob23xymatihi8" xml:space="preserve"> </w:t>
+            </w:r>
           </w:p>
         </w:tc>
         <w:tc vyd:_id="vyd:000000000000uj">
@@ -23409,6 +24456,14 @@
                 <w:szCs w:val="18"/>
               </w:rPr>
             </w:pPr>
+            <w:r>
+              <w:rPr>
+                <w:rFonts w:ascii="Times New Roman" w:hAnsi="Times New Roman" w:cs="Times New Roman"/>
+                <w:sz w:val="18"/>
+                <w:color w:val="000000"/>
+              </w:rPr>
+              <w:t vyd:_id="vyd:mob2b728r7dkoy">конспект</w:t>
+            </w:r>
           </w:p>
         </w:tc>
         <w:tc vyd:_id="vyd:000000000000u5">
@@ -23884,6 +24939,34 @@
                 <w:szCs w:val="18"/>
               </w:rPr>
             </w:pPr>
+            <w:r>
+              <w:rPr>
+                <w:rFonts w:ascii="Times New Roman" w:hAnsi="Times New Roman" w:eastAsia="Times New Roman" w:cs="Times New Roman"/>
+                <w:sz w:val="20"/>
+              </w:rPr>
+              <w:t vyd:_id="vyd:mob236n2pzee8t">Проведение</w:t>
+            </w:r>
+            <w:r>
+              <w:rPr>
+                <w:rFonts w:ascii="Times New Roman" w:hAnsi="Times New Roman" w:eastAsia="Times New Roman" w:cs="Times New Roman"/>
+                <w:sz w:val="20"/>
+              </w:rPr>
+              <w:t vyd:_id="vyd:mob236n12eljv9" xml:space="preserve">  </w:t>
+            </w:r>
+            <w:r>
+              <w:rPr>
+                <w:rFonts w:ascii="Times New Roman" w:hAnsi="Times New Roman" w:eastAsia="Times New Roman" w:cs="Times New Roman"/>
+                <w:sz w:val="20"/>
+              </w:rPr>
+              <w:t vyd:_id="vyd:mob236mzgv3rfm">и оформление результатов эмпирического исследования в области социальной работы</w:t>
+            </w:r>
+            <w:r>
+              <w:rPr>
+                <w:rFonts w:ascii="Times New Roman" w:hAnsi="Times New Roman" w:eastAsia="Times New Roman" w:cs="Times New Roman"/>
+                <w:sz w:val="20"/>
+              </w:rPr>
+              <w:t vyd:_id="vyd:mob236myo369kf" xml:space="preserve">  </w:t>
+            </w:r>
           </w:p>
         </w:tc>
         <w:tc vyd:_id="vyd:000000000000sy">
@@ -24072,14 +25155,40 @@
           <w:p vyd:_id="vyd:000000000000sj">
             <w:pPr>
               <w:pStyle w:val="Normal"/>
-              <w:snapToGrid w:val="0"/>
-              <w:spacing w:lineRule="auto" w:line="240" w:before="0" w:after="0"/>
-              <w:rPr>
-                <w:rFonts w:ascii="Times New Roman" w:hAnsi="Times New Roman" w:cs="Times New Roman"/>
-                <w:sz w:val="18"/>
-                <w:szCs w:val="18"/>
-              </w:rPr>
-            </w:pPr>
+              <w:spacing w:lineRule="auto" w:line="240" w:before="0" w:after="0"/>
+              <w:rPr>
+                <w:rFonts w:ascii="Times New Roman" w:hAnsi="Times New Roman" w:cs="Times New Roman"/>
+                <w:sz w:val="18"/>
+                <w:szCs w:val="18"/>
+              </w:rPr>
+            </w:pPr>
+            <w:r>
+              <w:fldChar w:fldCharType="begin" vyd:_id="vyd:mob23v8ti27d52"/>
+            </w:r>
+            <w:r>
+              <w:instrText>HYPERLINK "https://max.ru/joincall/0U1kh8z39AIttXpvG-B7nhNn6MB0yNPzjIxZvQnGjGI"</w:instrText>
+            </w:r>
+            <w:r>
+              <w:fldChar w:fldCharType="separate"/>
+            </w:r>
+            <w:r>
+              <w:rPr>
+                <w:rStyle w:val="Hyperlink"/>
+                <w:rFonts w:ascii="Times New Roman" w:hAnsi="Times New Roman" w:cs="Times New Roman"/>
+                <w:sz w:val="18"/>
+              </w:rPr>
+              <w:t vyd:_id="vyd:mob23rzc0qkcss">https://max.ru/joincall/0U1kh8z39AIttXpvG-B7nhNn6MB0yNPzjIxZvQnGjGI</w:t>
+            </w:r>
+            <w:r>
+              <w:fldChar w:fldCharType="end" vyd:_id="vyd:mob23v8ti27d52-end"/>
+            </w:r>
+            <w:r>
+              <w:rPr>
+                <w:rFonts w:ascii="Times New Roman" w:hAnsi="Times New Roman" w:cs="Times New Roman"/>
+                <w:sz w:val="18"/>
+              </w:rPr>
+              <w:t vyd:_id="vyd:mob23v8uwyhsa5" xml:space="preserve"> </w:t>
+            </w:r>
           </w:p>
         </w:tc>
         <w:tc vyd:_id="vyd:000000000000sg">
@@ -25679,7 +26788,24 @@
               <w:rPr>
                 <w:rFonts w:ascii="Times New Roman" w:hAnsi="Times New Roman" w:cs="Times New Roman"/>
                 <w:sz w:val="20"/>
-                <w:szCs w:val="20"/>
+              </w:rPr>
+            </w:pPr>
+            <w:r>
+              <w:rPr>
+                <w:rFonts w:ascii="Times New Roman" w:hAnsi="Times New Roman" w:cs="Times New Roman"/>
+                <w:sz w:val="20"/>
+              </w:rPr>
+              <w:t vyd:_id="vyd:mob4z07sq1lbe7">Просмотр ролков по ЭЛЕКТРОБЕЗОПАСТНОСТИ</w:t>
+            </w:r>
+          </w:p>
+          <w:p vyd:_id="vyd:mob56hxu343l8j">
+            <w:pPr>
+              <w:pStyle w:val="Normal"/>
+              <w:snapToGrid w:val="0"/>
+              <w:spacing w:lineRule="auto" w:line="240" w:before="0" w:after="0"/>
+              <w:rPr>
+                <w:rFonts w:ascii="Times New Roman" w:hAnsi="Times New Roman" w:cs="Times New Roman"/>
+                <w:sz w:val="20"/>
               </w:rPr>
             </w:pPr>
           </w:p>
@@ -25726,6 +26852,13 @@
                 <w:szCs w:val="20"/>
               </w:rPr>
             </w:pPr>
+            <w:r>
+              <w:rPr>
+                <w:rFonts w:ascii="Times New Roman" w:hAnsi="Times New Roman" w:cs="Times New Roman"/>
+                <w:sz w:val="20"/>
+              </w:rPr>
+              <w:t vyd:_id="vyd:mob20ywyr6z3mz">Дифференцированный зачет</w:t>
+            </w:r>
           </w:p>
         </w:tc>
         <w:tc vyd:_id="vyd:000000000000o2">
@@ -25750,6 +26883,14 @@
                 <w:szCs w:val="20"/>
               </w:rPr>
             </w:pPr>
+            <w:r>
+              <w:rPr>
+                <w:rFonts w:ascii="Times New Roman" w:hAnsi="Times New Roman" w:cs="Times New Roman"/>
+                <w:sz w:val="20"/>
+                <w:color w:val="000000"/>
+              </w:rPr>
+              <w:t vyd:_id="vyd:mob4aanhb68924">Составить дефектную ведомость подшипника</w:t>
+            </w:r>
           </w:p>
         </w:tc>
         <w:tc vyd:_id="vyd:000000000000o0">
@@ -25876,6 +27017,13 @@
                 <w:szCs w:val="20"/>
               </w:rPr>
             </w:pPr>
+            <w:r>
+              <w:rPr>
+                <w:rFonts w:ascii="Times New Roman" w:hAnsi="Times New Roman" w:cs="Times New Roman"/>
+                <w:sz w:val="20"/>
+              </w:rPr>
+              <w:t vyd:_id="vyd:mob5708tt1e0e2" xml:space="preserve">   MAX </w:t>
+            </w:r>
           </w:p>
         </w:tc>
         <w:tc vyd:_id="vyd:000000000000no">
@@ -25920,6 +27068,13 @@
                 <w:szCs w:val="20"/>
               </w:rPr>
             </w:pPr>
+            <w:r>
+              <w:rPr>
+                <w:rFonts w:ascii="Times New Roman" w:hAnsi="Times New Roman" w:cs="Times New Roman"/>
+                <w:sz w:val="20"/>
+              </w:rPr>
+              <w:t vyd:_id="vyd:mob21lipnamzh5">мах</w:t>
+            </w:r>
           </w:p>
         </w:tc>
         <w:tc vyd:_id="vyd:000000000000nk">
@@ -25944,6 +27099,14 @@
                 <w:szCs w:val="20"/>
               </w:rPr>
             </w:pPr>
+            <w:r>
+              <w:rPr>
+                <w:rFonts w:ascii="Times New Roman" w:hAnsi="Times New Roman" w:cs="Times New Roman"/>
+                <w:sz w:val="20"/>
+                <w:color w:val="000000"/>
+              </w:rPr>
+              <w:t vyd:_id="vyd:mob4c1recaegof">мах</w:t>
+            </w:r>
           </w:p>
         </w:tc>
         <w:tc vyd:_id="vyd:000000000000ni">
@@ -26067,7 +27230,46 @@
               <w:rPr>
                 <w:rFonts w:ascii="Times New Roman" w:hAnsi="Times New Roman" w:cs="Times New Roman"/>
                 <w:sz w:val="20"/>
-                <w:szCs w:val="20"/>
+              </w:rPr>
+            </w:pPr>
+            <w:r>
+              <w:rPr>
+                <w:rFonts w:ascii="Times New Roman" w:hAnsi="Times New Roman" w:cs="Times New Roman"/>
+                <w:sz w:val="20"/>
+              </w:rPr>
+              <w:t vyd:_id="vyd:mob58jwib04wf7">СОСТАВТЕ ТАБЛИЦУ</w:t>
+            </w:r>
+          </w:p>
+          <w:p vyd:_id="vyd:mob59ojtldgiav">
+            <w:pPr>
+              <w:pStyle w:val="Normal"/>
+              <w:snapToGrid w:val="0"/>
+              <w:spacing w:lineRule="auto" w:line="240" w:before="0" w:after="0"/>
+              <w:rPr>
+                <w:rFonts w:ascii="Times New Roman" w:hAnsi="Times New Roman" w:cs="Times New Roman"/>
+                <w:sz w:val="20"/>
+              </w:rPr>
+            </w:pPr>
+          </w:p>
+          <w:p vyd:_id="vyd:mob583zmyg90tz">
+            <w:pPr>
+              <w:pStyle w:val="Normal"/>
+              <w:snapToGrid w:val="0"/>
+              <w:spacing w:lineRule="auto" w:line="240" w:before="0" w:after="0"/>
+              <w:rPr>
+                <w:rFonts w:ascii="Times New Roman" w:hAnsi="Times New Roman" w:cs="Times New Roman"/>
+                <w:sz w:val="20"/>
+              </w:rPr>
+            </w:pPr>
+          </w:p>
+          <w:p vyd:_id="vyd:mob584l44u7ywi">
+            <w:pPr>
+              <w:pStyle w:val="Normal"/>
+              <w:snapToGrid w:val="0"/>
+              <w:spacing w:lineRule="auto" w:line="240" w:before="0" w:after="0"/>
+              <w:rPr>
+                <w:rFonts w:ascii="Times New Roman" w:hAnsi="Times New Roman" w:cs="Times New Roman"/>
+                <w:sz w:val="20"/>
               </w:rPr>
             </w:pPr>
           </w:p>
@@ -26138,6 +27340,14 @@
                 <w:szCs w:val="20"/>
               </w:rPr>
             </w:pPr>
+            <w:r>
+              <w:rPr>
+                <w:rFonts w:ascii="Times New Roman" w:hAnsi="Times New Roman" w:cs="Times New Roman"/>
+                <w:sz w:val="20"/>
+                <w:color w:val="000000"/>
+              </w:rPr>
+              <w:t vyd:_id="vyd:mob4in4bnhyond">Изобразить схему подшипника с указанием основных позиций</w:t>
+            </w:r>
           </w:p>
         </w:tc>
         <w:tc vyd:_id="vyd:000000000000n0">
@@ -26547,6 +27757,13 @@
                 <w:szCs w:val="20"/>
               </w:rPr>
             </w:pPr>
+            <w:r>
+              <w:rPr>
+                <w:rFonts w:ascii="Times New Roman" w:hAnsi="Times New Roman" w:cs="Times New Roman"/>
+                <w:sz w:val="20"/>
+              </w:rPr>
+              <w:t vyd:_id="vyd:mob21r439olaf6">зачет</w:t>
+            </w:r>
           </w:p>
         </w:tc>
         <w:tc vyd:_id="vyd:000000000000lw">
@@ -26571,6 +27788,13 @@
                 <w:szCs w:val="20"/>
               </w:rPr>
             </w:pPr>
+            <w:r>
+              <w:rPr>
+                <w:sz w:val="20"/>
+                <w:color w:val="000000"/>
+              </w:rPr>
+              <w:t vyd:_id="vyd:mob4bdnjspgavn">Составить дефектную ведомость подшипника</w:t>
+            </w:r>
           </w:p>
         </w:tc>
         <w:tc vyd:_id="vyd:000000000000lu">
@@ -26740,6 +27964,13 @@
                 <w:szCs w:val="20"/>
               </w:rPr>
             </w:pPr>
+            <w:r>
+              <w:rPr>
+                <w:rFonts w:ascii="Times New Roman" w:hAnsi="Times New Roman" w:cs="Times New Roman"/>
+                <w:sz w:val="20"/>
+              </w:rPr>
+              <w:t vyd:_id="vyd:mob21vsq9bpipu">мах</w:t>
+            </w:r>
           </w:p>
         </w:tc>
         <w:tc vyd:_id="vyd:000000000000le">
@@ -26764,6 +27995,14 @@
                 <w:szCs w:val="20"/>
               </w:rPr>
             </w:pPr>
+            <w:r>
+              <w:rPr>
+                <w:rFonts w:ascii="Times New Roman" w:hAnsi="Times New Roman" w:cs="Times New Roman"/>
+                <w:sz w:val="20"/>
+                <w:color w:val="000000"/>
+              </w:rPr>
+              <w:t vyd:_id="vyd:mob4bkrxnw5zqw">мах</w:t>
+            </w:r>
           </w:p>
         </w:tc>
         <w:tc vyd:_id="vyd:000000000000lc">
@@ -26957,6 +28196,14 @@
                 <w:szCs w:val="20"/>
               </w:rPr>
             </w:pPr>
+            <w:r>
+              <w:rPr>
+                <w:rFonts w:ascii="Times New Roman" w:hAnsi="Times New Roman" w:cs="Times New Roman"/>
+                <w:sz w:val="20"/>
+                <w:color w:val="000000"/>
+              </w:rPr>
+              <w:t vyd:_id="vyd:mob4htuhvgsm0f">Подготовить материал к реферату</w:t>
+            </w:r>
           </w:p>
         </w:tc>
         <w:tc vyd:_id="vyd:000000000000ku">
@@ -27352,6 +28599,13 @@
                 <w:szCs w:val="20"/>
               </w:rPr>
             </w:pPr>
+            <w:r>
+              <w:rPr>
+                <w:rFonts w:ascii="Times New Roman" w:hAnsi="Times New Roman" w:cs="Times New Roman"/>
+                <w:sz w:val="20"/>
+              </w:rPr>
+              <w:t vyd:_id="vyd:mob22gdtzkd660">Ситуация и ее анализ</w:t>
+            </w:r>
           </w:p>
         </w:tc>
         <w:tc vyd:_id="vyd:000000000000jr">
@@ -27396,6 +28650,13 @@
                 <w:szCs w:val="20"/>
               </w:rPr>
             </w:pPr>
+            <w:r>
+              <w:rPr>
+                <w:rFonts w:ascii="Times New Roman" w:hAnsi="Times New Roman" w:cs="Times New Roman"/>
+                <w:sz w:val="20"/>
+              </w:rPr>
+              <w:t vyd:_id="vyd:mob4eku5x6n9os">Формующий инструмент по переработке термопластов</w:t>
+            </w:r>
           </w:p>
         </w:tc>
         <w:tc vyd:_id="vyd:000000000000jn">
@@ -27541,6 +28802,13 @@
                 <w:szCs w:val="20"/>
               </w:rPr>
             </w:pPr>
+            <w:r>
+              <w:rPr>
+                <w:rFonts w:ascii="Times New Roman" w:hAnsi="Times New Roman" w:cs="Times New Roman"/>
+                <w:sz w:val="20"/>
+              </w:rPr>
+              <w:t vyd:_id="vyd:mob236ojmgkn86">мах</w:t>
+            </w:r>
           </w:p>
         </w:tc>
         <w:tc vyd:_id="vyd:000000000000j9">
@@ -27585,6 +28853,13 @@
                 <w:szCs w:val="20"/>
               </w:rPr>
             </w:pPr>
+            <w:r>
+              <w:rPr>
+                <w:rFonts w:ascii="Times New Roman" w:hAnsi="Times New Roman" w:cs="Times New Roman"/>
+                <w:sz w:val="20"/>
+              </w:rPr>
+              <w:t vyd:_id="vyd:mob4foxueexxlm">мах</w:t>
+            </w:r>
           </w:p>
         </w:tc>
         <w:tc vyd:_id="vyd:000000000000j5">
@@ -27730,6 +29005,13 @@
                 <w:szCs w:val="20"/>
               </w:rPr>
             </w:pPr>
+            <w:r>
+              <w:rPr>
+                <w:rFonts w:ascii="Times New Roman" w:hAnsi="Times New Roman" w:cs="Times New Roman"/>
+                <w:sz w:val="20"/>
+              </w:rPr>
+              <w:t vyd:_id="vyd:mob24ghxh79hcf">Решение ситуационных задач</w:t>
+            </w:r>
           </w:p>
         </w:tc>
         <w:tc vyd:_id="vyd:000000000000ir">
@@ -27774,6 +29056,13 @@
                 <w:szCs w:val="20"/>
               </w:rPr>
             </w:pPr>
+            <w:r>
+              <w:rPr>
+                <w:rFonts w:ascii="Times New Roman" w:hAnsi="Times New Roman" w:cs="Times New Roman"/>
+                <w:sz w:val="20"/>
+              </w:rPr>
+              <w:t vyd:_id="vyd:mob4gp6xnq5flp">Зарисовать схему экструдера</w:t>
+            </w:r>
           </w:p>
         </w:tc>
         <w:tc vyd:_id="vyd:000000000000in">
@@ -28170,6 +29459,13 @@
                 <w:szCs w:val="20"/>
               </w:rPr>
             </w:pPr>
+            <w:r>
+              <w:rPr>
+                <w:rFonts w:ascii="Times New Roman" w:hAnsi="Times New Roman" w:cs="Times New Roman"/>
+                <w:sz w:val="20"/>
+              </w:rPr>
+              <w:t vyd:_id="vyd:mob4d2kt4s9tou">Решение и осуждение вопросов перед экзаменом</w:t>
+            </w:r>
           </w:p>
         </w:tc>
         <w:tc vyd:_id="vyd:000000000000hk">
@@ -28359,6 +29655,13 @@
                 <w:szCs w:val="20"/>
               </w:rPr>
             </w:pPr>
+            <w:r>
+              <w:rPr>
+                <w:rFonts w:ascii="Times New Roman" w:hAnsi="Times New Roman" w:cs="Times New Roman"/>
+                <w:sz w:val="20"/>
+              </w:rPr>
+              <w:t vyd:_id="vyd:mob4dkzqxs0s4l">мах</w:t>
+            </w:r>
           </w:p>
         </w:tc>
         <w:tc vyd:_id="vyd:000000000000h2">
@@ -31194,6 +32497,13 @@
                 <w:szCs w:val="14"/>
               </w:rPr>
             </w:pPr>
+            <w:r>
+              <w:rPr>
+                <w:rFonts w:ascii="Times New Roman" w:hAnsi="Times New Roman" w:cs="Times New Roman"/>
+                <w:sz w:val="14"/>
+              </w:rPr>
+              <w:t vyd:_id="vyd:mob5an1ykshxrc">АВТОМАТЕЗИРОВАННЫЕ СИСТЕМЫ КОНТРОЛЯ ОБЖИМНОГО СТАНА</w:t>
+            </w:r>
           </w:p>
         </w:tc>
         <w:tc vyd:_id="vyd:0000000000009r">
@@ -31337,6 +32647,13 @@
                 <w:szCs w:val="14"/>
               </w:rPr>
             </w:pPr>
+            <w:r>
+              <w:rPr>
+                <w:rFonts w:ascii="Times New Roman" w:hAnsi="Times New Roman" w:cs="Times New Roman"/>
+                <w:sz w:val="14"/>
+              </w:rPr>
+              <w:t vyd:_id="vyd:mob5dlkctmt0tw">MAX</w:t>
+            </w:r>
           </w:p>
         </w:tc>
         <w:tc vyd:_id="vyd:0000000000009d">
@@ -31477,7 +32794,24 @@
               <w:rPr>
                 <w:rFonts w:ascii="Times New Roman" w:hAnsi="Times New Roman" w:cs="Times New Roman"/>
                 <w:sz w:val="14"/>
-                <w:szCs w:val="14"/>
+              </w:rPr>
+            </w:pPr>
+            <w:r>
+              <w:rPr>
+                <w:rFonts w:ascii="Times New Roman" w:hAnsi="Times New Roman" w:cs="Times New Roman"/>
+                <w:sz w:val="14"/>
+              </w:rPr>
+              <w:t vyd:_id="vyd:mob5dxk19p0g7s">ВЫПОЛНИТЕ ПРОКТИЧЕСКОЕ ЗАДАНИЕ</w:t>
+            </w:r>
+          </w:p>
+          <w:p vyd:_id="vyd:mob5fngxtr1uq9">
+            <w:pPr>
+              <w:pStyle w:val="Normal"/>
+              <w:snapToGrid w:val="0"/>
+              <w:spacing w:lineRule="auto" w:line="240" w:before="0" w:after="0"/>
+              <w:rPr>
+                <w:rFonts w:ascii="Times New Roman" w:hAnsi="Times New Roman" w:cs="Times New Roman"/>
+                <w:sz w:val="14"/>
               </w:rPr>
             </w:pPr>
           </w:p>
@@ -31810,6 +33144,13 @@
                 <w:szCs w:val="14"/>
               </w:rPr>
             </w:pPr>
+            <w:r>
+              <w:rPr>
+                <w:rFonts w:ascii="Times New Roman" w:hAnsi="Times New Roman" w:cs="Times New Roman"/>
+                <w:sz w:val="14"/>
+              </w:rPr>
+              <w:t vyd:_id="vyd:mob5gahftg1ef7">Автоматизированны системы  контоля обжимного стана</w:t>
+            </w:r>
           </w:p>
         </w:tc>
         <w:tc vyd:_id="vyd:00000000000083">
@@ -31951,6 +33292,13 @@
                 <w:szCs w:val="14"/>
               </w:rPr>
             </w:pPr>
+            <w:r>
+              <w:rPr>
+                <w:rFonts w:ascii="Times New Roman" w:hAnsi="Times New Roman" w:cs="Times New Roman"/>
+                <w:sz w:val="14"/>
+              </w:rPr>
+              <w:t vyd:_id="vyd:mob5i9vl0qtmw4" xml:space="preserve">  MAX</w:t>
+            </w:r>
           </w:p>
         </w:tc>
         <w:tc vyd:_id="vyd:0000000000007p">
@@ -32092,6 +33440,13 @@
                 <w:szCs w:val="14"/>
               </w:rPr>
             </w:pPr>
+            <w:r>
+              <w:rPr>
+                <w:rFonts w:ascii="Times New Roman" w:hAnsi="Times New Roman" w:cs="Times New Roman"/>
+                <w:sz w:val="14"/>
+              </w:rPr>
+              <w:t vyd:_id="vyd:mob5ivz8fmvs0u">Выполните  практическое задание</w:t>
+            </w:r>
           </w:p>
         </w:tc>
         <w:tc vyd:_id="vyd:0000000000007b">
@@ -32432,6 +33787,13 @@
                 <w:szCs w:val="14"/>
               </w:rPr>
             </w:pPr>
+            <w:r>
+              <w:rPr>
+                <w:rFonts w:ascii="Times New Roman" w:hAnsi="Times New Roman" w:cs="Times New Roman"/>
+                <w:sz w:val="14"/>
+              </w:rPr>
+              <w:t vyd:_id="vyd:mob1n1ou9vdin8">Present Simple</w:t>
+            </w:r>
           </w:p>
         </w:tc>
         <w:tc vyd:_id="vyd:0000000000006d">
@@ -32489,11 +33851,17 @@
               <w:snapToGrid w:val="0"/>
               <w:spacing w:lineRule="auto" w:line="240" w:before="0" w:after="0"/>
               <w:rPr>
-                <w:rFonts w:ascii="Times New Roman" w:hAnsi="Times New Roman" w:cs="Times New Roman"/>
-                <w:sz w:val="24"/>
-                <w:szCs w:val="24"/>
-              </w:rPr>
-            </w:pPr>
+                <w:rFonts/>
+                <w:szCs w:val="24"/>
+              </w:rPr>
+            </w:pPr>
+            <w:r>
+              <w:rPr>
+                <w:rFonts w:ascii="Times New Roman" w:hAnsi="Times New Roman" w:cs="Times New Roman"/>
+                <w:sz w:val="18"/>
+              </w:rPr>
+              <w:t vyd:_id="vyd:mob42eht95rm44">Правила игры «Футбол»</w:t>
+            </w:r>
           </w:p>
         </w:tc>
       </w:tr>
@@ -32631,10 +33999,16 @@
               <w:spacing w:lineRule="auto" w:line="240" w:before="0" w:after="0"/>
               <w:rPr>
                 <w:rFonts w:ascii="Times New Roman" w:hAnsi="Times New Roman" w:cs="Times New Roman"/>
-                <w:sz w:val="24"/>
-                <w:szCs w:val="24"/>
-              </w:rPr>
-            </w:pPr>
+                <w:sz w:val="20"/>
+              </w:rPr>
+            </w:pPr>
+            <w:r>
+              <w:rPr>
+                <w:rFonts w:ascii="Times New Roman" w:hAnsi="Times New Roman" w:cs="Times New Roman"/>
+                <w:sz w:val="20"/>
+              </w:rPr>
+              <w:t vyd:_id="vyd:mob45ndbhxysns">MAX</w:t>
+            </w:r>
           </w:p>
         </w:tc>
       </w:tr>
@@ -32714,6 +34088,13 @@
                 <w:szCs w:val="14"/>
               </w:rPr>
             </w:pPr>
+            <w:r>
+              <w:rPr>
+                <w:rFonts w:ascii="Times New Roman" w:hAnsi="Times New Roman" w:cs="Times New Roman"/>
+                <w:sz w:val="14"/>
+              </w:rPr>
+              <w:t vyd:_id="vyd:mob1ojybvutqhp">Повторить теоретический материал</w:t>
+            </w:r>
           </w:p>
         </w:tc>
         <w:tc vyd:_id="vyd:0000000000005l">
@@ -33085,6 +34466,13 @@
                 <w:szCs w:val="16"/>
               </w:rPr>
             </w:pPr>
+            <w:r>
+              <w:rPr>
+                <w:rFonts w:ascii="Times New Roman" w:hAnsi="Times New Roman" w:cs="Times New Roman"/>
+                <w:sz w:val="16"/>
+              </w:rPr>
+              <w:t vyd:_id="vyd:mob1q4gfdbgtla">Future Simple</w:t>
+            </w:r>
           </w:p>
         </w:tc>
         <w:tc vyd:_id="vyd:0000000000004l">
@@ -33107,6 +34495,13 @@
                 <w:szCs w:val="16"/>
               </w:rPr>
             </w:pPr>
+            <w:r>
+              <w:rPr>
+                <w:rFonts w:ascii="Times New Roman" w:hAnsi="Times New Roman" w:cs="Times New Roman"/>
+                <w:sz w:val="16"/>
+              </w:rPr>
+              <w:t vyd:_id="vyd:mob47y10x7al0n">Правиа игры «Волейбол»</w:t>
+            </w:r>
           </w:p>
         </w:tc>
         <w:tc vyd:_id="vyd:0000000000004j">
@@ -33252,10 +34647,15 @@
               <w:spacing w:lineRule="auto" w:line="240" w:before="0" w:after="0"/>
               <w:rPr>
                 <w:rFonts w:ascii="Times New Roman" w:hAnsi="Times New Roman" w:cs="Times New Roman"/>
-                <w:sz w:val="24"/>
-                <w:szCs w:val="24"/>
-              </w:rPr>
-            </w:pPr>
+                <w:szCs w:val="24"/>
+              </w:rPr>
+            </w:pPr>
+            <w:r>
+              <w:rPr>
+                <w:rFonts w:ascii="Times New Roman" w:hAnsi="Times New Roman" w:cs="Times New Roman"/>
+              </w:rPr>
+              <w:t vyd:_id="vyd:mob4910lgmjkob">MAX</w:t>
+            </w:r>
           </w:p>
         </w:tc>
         <w:tc vyd:_id="vyd:00000000000045">
@@ -33383,6 +34783,12 @@
                 <w:rFonts w:ascii="Times New Roman" w:hAnsi="Times New Roman" w:cs="Times New Roman"/>
               </w:rPr>
             </w:pPr>
+            <w:r>
+              <w:rPr>
+                <w:rFonts w:ascii="Times New Roman" w:hAnsi="Times New Roman" w:cs="Times New Roman"/>
+              </w:rPr>
+              <w:t vyd:_id="vyd:mob1rl8ztp2pv4">Плвориьтеоретчесий материал</w:t>
+            </w:r>
           </w:p>
         </w:tc>
         <w:tc vyd:_id="vyd:0000000000003t">
@@ -34824,7 +36230,7 @@
 </file>
 
 <file path=word/footer1.xml><?xml version="1.0" encoding="utf-8"?>
-<w:ftr xmlns:vyd="http://volga.yandex.com/schemas/document/model" xmlns:w="http://schemas.openxmlformats.org/wordprocessingml/2006/main" vyd:_id="vyd:000000000002hq">
+<w:ftr xmlns:w="http://schemas.openxmlformats.org/wordprocessingml/2006/main" xmlns:vyd="http://volga.yandex.com/schemas/document/model" vyd:_id="vyd:000000000002hq">
   <w:p vyd:_id="vyd:000000000002hr">
     <w:pPr>
       <w:pStyle w:val="Footer"/>

</xml_diff>

<commit_message>
Sync schedule files 2026-04-23 09:28
</commit_message>
<xml_diff>
--- a/schedule/23.04.2026 ЧЕТВЕРГ дистант.docx
+++ b/schedule/23.04.2026 ЧЕТВЕРГ дистант.docx
@@ -1,6 +1,6 @@
 
 <file path=word/document.xml><?xml version="1.0" encoding="utf-8"?>
-<w:document xmlns:r="http://schemas.openxmlformats.org/officeDocument/2006/relationships" xmlns:mc="http://schemas.openxmlformats.org/markup-compatibility/2006" xmlns:vyd="http://volga.yandex.com/schemas/document/model" xmlns:w="http://schemas.openxmlformats.org/wordprocessingml/2006/main" w:conformance="transitional" mc:Ignorable="vyd">
+<w:document xmlns:r="http://schemas.openxmlformats.org/officeDocument/2006/relationships" xmlns:w="http://schemas.openxmlformats.org/wordprocessingml/2006/main" xmlns:vyd="http://volga.yandex.com/schemas/document/model" xmlns:mc="http://schemas.openxmlformats.org/markup-compatibility/2006" w:conformance="transitional" mc:Ignorable="vyd">
   <w:background w:color="FFFFFF"/>
   <w:body vyd:_id="vyd:00000000000001">
     <w:p vyd:_id="vyd:000000000002hp">
@@ -4612,6 +4612,12 @@
                 <w:rFonts w:ascii="Times New Roman" w:hAnsi="Times New Roman" w:cs="Times New Roman"/>
               </w:rPr>
             </w:pPr>
+            <w:r>
+              <w:rPr>
+                <w:rFonts w:ascii="Times New Roman" w:hAnsi="Times New Roman" w:cs="Times New Roman"/>
+              </w:rPr>
+              <w:t vyd:_id="vyd:mob7wa5v51k6oy">Параграф 3.4</w:t>
+            </w:r>
           </w:p>
         </w:tc>
         <w:tc vyd:_id="vyd:00000000000272">
@@ -4858,6 +4864,12 @@
                 <w:rFonts w:ascii="Times New Roman" w:hAnsi="Times New Roman" w:cs="Times New Roman"/>
               </w:rPr>
             </w:pPr>
+            <w:r>
+              <w:rPr>
+                <w:rFonts w:ascii="Times New Roman" w:hAnsi="Times New Roman" w:cs="Times New Roman"/>
+              </w:rPr>
+              <w:t vyd:_id="vyd:mob7wkdj6bm3b8">https://studfile.net/preview/2099568/page:18/</w:t>
+            </w:r>
           </w:p>
         </w:tc>
         <w:tc vyd:_id="vyd:0000000000026i">
@@ -5105,6 +5117,12 @@
                 <w:rFonts w:ascii="Times New Roman" w:hAnsi="Times New Roman" w:cs="Times New Roman"/>
               </w:rPr>
             </w:pPr>
+            <w:r>
+              <w:rPr>
+                <w:rFonts w:ascii="Times New Roman" w:hAnsi="Times New Roman" w:cs="Times New Roman"/>
+              </w:rPr>
+              <w:t vyd:_id="vyd:mob7wnznfj0scc" xml:space="preserve">Ответы на вопросы для са оконтроля </w:t>
+            </w:r>
           </w:p>
         </w:tc>
         <w:tc vyd:_id="vyd:0000000000025y">
@@ -10445,6 +10463,13 @@
                 <w:szCs w:val="24"/>
               </w:rPr>
             </w:pPr>
+            <w:r>
+              <w:rPr>
+                <w:rFonts w:ascii="Times New Roman" w:hAnsi="Times New Roman" w:cs="Times New Roman"/>
+                <w:sz w:val="24"/>
+              </w:rPr>
+              <w:t vyd:_id="vyd:mob7xkga5ompn8">Параграф 3.4</w:t>
+            </w:r>
           </w:p>
         </w:tc>
         <w:tc vyd:_id="vyd:000000000001sp">
@@ -10676,6 +10701,13 @@
                 <w:szCs w:val="24"/>
               </w:rPr>
             </w:pPr>
+            <w:r>
+              <w:rPr>
+                <w:rFonts w:ascii="Times New Roman" w:hAnsi="Times New Roman" w:cs="Times New Roman"/>
+                <w:sz w:val="24"/>
+              </w:rPr>
+              <w:t vyd:_id="vyd:mob7y4scnyy60v">https://studfile.net/preview/2099568/page:18/</w:t>
+            </w:r>
           </w:p>
         </w:tc>
         <w:tc vyd:_id="vyd:000000000001s5">
@@ -10907,6 +10939,13 @@
                 <w:szCs w:val="24"/>
               </w:rPr>
             </w:pPr>
+            <w:r>
+              <w:rPr>
+                <w:rFonts w:ascii="Times New Roman" w:hAnsi="Times New Roman" w:cs="Times New Roman"/>
+                <w:sz w:val="24"/>
+              </w:rPr>
+              <w:t vyd:_id="vyd:mob7y8d4xvy7c0">Ответы на вопросы для самоконтроля</w:t>
+            </w:r>
           </w:p>
         </w:tc>
         <w:tc vyd:_id="vyd:000000000001rl">
@@ -16466,6 +16505,13 @@
                 <w:szCs w:val="24"/>
               </w:rPr>
             </w:pPr>
+            <w:r>
+              <w:rPr>
+                <w:rFonts w:ascii="Times New Roman" w:hAnsi="Times New Roman" w:cs="Times New Roman"/>
+                <w:sz w:val="24"/>
+              </w:rPr>
+              <w:t vyd:_id="vyd:mob7zevtuxd73p">Параграф 3.4</w:t>
+            </w:r>
           </w:p>
         </w:tc>
       </w:tr>
@@ -16705,6 +16751,13 @@
                 <w:szCs w:val="24"/>
               </w:rPr>
             </w:pPr>
+            <w:r>
+              <w:rPr>
+                <w:rFonts w:ascii="Times New Roman" w:hAnsi="Times New Roman" w:cs="Times New Roman"/>
+                <w:sz w:val="24"/>
+              </w:rPr>
+              <w:t vyd:_id="vyd:mob7zoe8oaorz9">https://studfile.net/preview/2099568/page:18/</w:t>
+            </w:r>
           </w:p>
         </w:tc>
       </w:tr>
@@ -16951,6 +17004,13 @@
                 <w:szCs w:val="24"/>
               </w:rPr>
             </w:pPr>
+            <w:r>
+              <w:rPr>
+                <w:rFonts w:ascii="Times New Roman" w:hAnsi="Times New Roman" w:cs="Times New Roman"/>
+                <w:sz w:val="24"/>
+              </w:rPr>
+              <w:t vyd:_id="vyd:mob7zqvdr3zqkj">Ответы на вопросы для самоконтроля</w:t>
+            </w:r>
           </w:p>
         </w:tc>
       </w:tr>
@@ -36230,7 +36290,7 @@
 </file>
 
 <file path=word/footer1.xml><?xml version="1.0" encoding="utf-8"?>
-<w:ftr xmlns:w="http://schemas.openxmlformats.org/wordprocessingml/2006/main" xmlns:vyd="http://volga.yandex.com/schemas/document/model" vyd:_id="vyd:000000000002hq">
+<w:ftr xmlns:vyd="http://volga.yandex.com/schemas/document/model" xmlns:w="http://schemas.openxmlformats.org/wordprocessingml/2006/main" vyd:_id="vyd:000000000002hq">
   <w:p vyd:_id="vyd:000000000002hr">
     <w:pPr>
       <w:pStyle w:val="Footer"/>

</xml_diff>

<commit_message>
Sync schedule files 2026-04-23 13:29
</commit_message>
<xml_diff>
--- a/schedule/23.04.2026 ЧЕТВЕРГ дистант.docx
+++ b/schedule/23.04.2026 ЧЕТВЕРГ дистант.docx
@@ -1,6 +1,6 @@
 
 <file path=word/document.xml><?xml version="1.0" encoding="utf-8"?>
-<w:document xmlns:r="http://schemas.openxmlformats.org/officeDocument/2006/relationships" xmlns:w="http://schemas.openxmlformats.org/wordprocessingml/2006/main" xmlns:vyd="http://volga.yandex.com/schemas/document/model" xmlns:mc="http://schemas.openxmlformats.org/markup-compatibility/2006" w:conformance="transitional" mc:Ignorable="vyd">
+<w:document xmlns:w="http://schemas.openxmlformats.org/wordprocessingml/2006/main" xmlns:vyd="http://volga.yandex.com/schemas/document/model" xmlns:mc="http://schemas.openxmlformats.org/markup-compatibility/2006" xmlns:r="http://schemas.openxmlformats.org/officeDocument/2006/relationships" w:conformance="transitional" mc:Ignorable="vyd">
   <w:background w:color="FFFFFF"/>
   <w:body vyd:_id="vyd:00000000000001">
     <w:p vyd:_id="vyd:000000000002hp">
@@ -3436,10 +3436,17 @@
               <w:spacing w:lineRule="auto" w:line="240" w:before="0" w:after="0"/>
               <w:rPr>
                 <w:rFonts w:ascii="Times New Roman" w:hAnsi="Times New Roman" w:cs="Times New Roman"/>
-                <w:sz w:val="24"/>
-                <w:szCs w:val="24"/>
-              </w:rPr>
-            </w:pPr>
+                <w:sz w:val="20"/>
+                <w:szCs w:val="24"/>
+              </w:rPr>
+            </w:pPr>
+            <w:r>
+              <w:rPr>
+                <w:rFonts w:ascii="Times New Roman" w:hAnsi="Times New Roman" w:eastAsia="Times New Roman" w:cs="Times New Roman"/>
+                <w:sz w:val="20"/>
+              </w:rPr>
+              <w:t vyd:_id="vyd:mobhjtyw116f12">Технические устройства и практическое применение</w:t>
+            </w:r>
           </w:p>
         </w:tc>
         <w:tc vyd:_id="vyd:0000000000029r">
@@ -3653,12 +3660,13 @@
               <w:spacing w:lineRule="auto" w:line="240" w:before="0" w:after="0"/>
               <w:rPr>
                 <w:rFonts w:ascii="Times New Roman" w:hAnsi="Times New Roman" w:cs="Times New Roman"/>
-              </w:rPr>
-            </w:pPr>
-            <w:r>
-              <w:rPr>
-                <w:rFonts w:ascii="Times New Roman" w:hAnsi="Times New Roman" w:cs="Times New Roman"/>
-                <w:sz w:val="18"/>
+                <w:sz w:val="20"/>
+              </w:rPr>
+            </w:pPr>
+            <w:r>
+              <w:rPr>
+                <w:rFonts w:ascii="Times New Roman" w:hAnsi="Times New Roman" w:cs="Times New Roman"/>
+                <w:sz w:val="16"/>
               </w:rPr>
               <w:t vyd:_id="vyd:mob3b53rb2im7k">МАХ</w:t>
             </w:r>
@@ -3675,12 +3683,27 @@
           </w:tcPr>
           <w:p vyd:_id="vyd:0000000000029a">
             <w:pPr>
-              <w:pStyle w:val="Normal"/>
-              <w:snapToGrid w:val="0"/>
-              <w:spacing w:lineRule="auto" w:line="240" w:before="0" w:after="0"/>
-              <w:rPr>
-                <w:rFonts w:ascii="Times New Roman" w:hAnsi="Times New Roman" w:cs="Times New Roman"/>
-                <w:sz w:val="24"/>
+              <w:spacing w:after="240"/>
+              <w:rPr>
+                <w:sz w:val="20"/>
+              </w:rPr>
+            </w:pPr>
+            <w:r>
+              <w:rPr>
+                <w:rFonts w:ascii="Times New Roman" w:hAnsi="Times New Roman" w:eastAsia="Times New Roman" w:cs="Times New Roman"/>
+                <w:sz w:val="22"/>
+              </w:rPr>
+              <w:t vyd:_id="vyd:mobhyxfijkl5j4">мах</w:t>
+            </w:r>
+          </w:p>
+          <w:p vyd:_id="vyd:mobhyxf6ggq0e8">
+            <w:pPr>
+              <w:pStyle w:val="Normal"/>
+              <w:snapToGrid w:val="0"/>
+              <w:spacing w:lineRule="auto" w:line="240" w:before="0" w:after="0"/>
+              <w:rPr>
+                <w:rFonts w:ascii="Times New Roman" w:hAnsi="Times New Roman" w:cs="Times New Roman"/>
+                <w:sz w:val="22"/>
                 <w:szCs w:val="24"/>
               </w:rPr>
             </w:pPr>
@@ -3912,6 +3935,21 @@
           </w:tcPr>
           <w:p vyd:_id="vyd:0000000000028q">
             <w:pPr>
+              <w:spacing w:after="240"/>
+              <w:rPr>
+                <w:sz w:val="18"/>
+              </w:rPr>
+            </w:pPr>
+            <w:r>
+              <w:rPr>
+                <w:rFonts w:ascii="Times New Roman" w:hAnsi="Times New Roman" w:eastAsia="Times New Roman" w:cs="Times New Roman"/>
+                <w:sz w:val="20"/>
+              </w:rPr>
+              <w:t vyd:_id="vyd:mobhwcqnidey3f">Сделать конспект</w:t>
+            </w:r>
+          </w:p>
+          <w:p vyd:_id="vyd:mobhwcqd0tsyqa">
+            <w:pPr>
               <w:pStyle w:val="Normal"/>
               <w:snapToGrid w:val="0"/>
               <w:spacing w:lineRule="auto" w:line="240" w:before="0" w:after="0"/>
@@ -4553,6 +4591,27 @@
                 <w:szCs w:val="24"/>
               </w:rPr>
             </w:pPr>
+            <w:r>
+              <w:rPr>
+                <w:rFonts w:ascii="Times New Roman" w:hAnsi="Times New Roman" w:eastAsia="Times New Roman" w:cs="Times New Roman"/>
+                <w:sz w:val="20"/>
+              </w:rPr>
+              <w:t vyd:_id="vyd:mobhp65zzutyfe" xml:space="preserve">Вид звездного неба. </w:t>
+            </w:r>
+            <w:r>
+              <w:rPr>
+                <w:rFonts w:ascii="Times New Roman" w:hAnsi="Times New Roman" w:eastAsia="Times New Roman" w:cs="Times New Roman"/>
+                <w:sz w:val="20"/>
+              </w:rPr>
+              <w:t vyd:_id="vyd:mobhp659xvgkos" xml:space="preserve">Созвездия, яркие звезды, планеты, их видимое движение. </w:t>
+            </w:r>
+            <w:r>
+              <w:rPr>
+                <w:rFonts w:ascii="Times New Roman" w:hAnsi="Times New Roman" w:eastAsia="Times New Roman" w:cs="Times New Roman"/>
+                <w:sz w:val="20"/>
+              </w:rPr>
+              <w:t vyd:_id="vyd:mobhp64kg4hkm5">Солнечная система. Планеты земной группы.</w:t>
+            </w:r>
           </w:p>
         </w:tc>
         <w:tc vyd:_id="vyd:00000000000276">
@@ -4796,6 +4855,21 @@
           </w:tcPr>
           <w:p vyd:_id="vyd:0000000000026p">
             <w:pPr>
+              <w:spacing w:after="240"/>
+              <w:rPr>
+                <w:sz w:val="22"/>
+              </w:rPr>
+            </w:pPr>
+            <w:r>
+              <w:rPr>
+                <w:rFonts w:ascii="Times New Roman" w:hAnsi="Times New Roman" w:eastAsia="Times New Roman" w:cs="Times New Roman"/>
+                <w:sz w:val="24"/>
+              </w:rPr>
+              <w:t vyd:_id="vyd:mobhy2a9d03xbl">мах</w:t>
+            </w:r>
+          </w:p>
+          <w:p vyd:_id="vyd:mobhy2a3u84voy">
+            <w:pPr>
               <w:pStyle w:val="Normal"/>
               <w:snapToGrid w:val="0"/>
               <w:spacing w:lineRule="auto" w:line="240" w:before="0" w:after="0"/>
@@ -5048,6 +5122,21 @@
             </w:tcBorders>
           </w:tcPr>
           <w:p vyd:_id="vyd:00000000000265">
+            <w:pPr>
+              <w:spacing w:after="240"/>
+              <w:rPr>
+                <w:sz w:val="16"/>
+              </w:rPr>
+            </w:pPr>
+            <w:r>
+              <w:rPr>
+                <w:rFonts w:ascii="Times New Roman" w:hAnsi="Times New Roman" w:eastAsia="Times New Roman" w:cs="Times New Roman"/>
+                <w:sz w:val="18"/>
+              </w:rPr>
+              <w:t vyd:_id="vyd:mobhwzssbt8a1k">Сделать конспект</w:t>
+            </w:r>
+          </w:p>
+          <w:p vyd:_id="vyd:mobhwzsmdsz51b">
             <w:pPr>
               <w:pStyle w:val="Normal"/>
               <w:snapToGrid w:val="0"/>

</xml_diff>

<commit_message>
Sync schedule files 2026-04-27 05:54
</commit_message>
<xml_diff>
--- a/schedule/23.04.2026 ЧЕТВЕРГ дистант.docx
+++ b/schedule/23.04.2026 ЧЕТВЕРГ дистант.docx
@@ -1,6 +1,6 @@
 
 <file path=word/document.xml><?xml version="1.0" encoding="utf-8"?>
-<w:document xmlns:w="http://schemas.openxmlformats.org/wordprocessingml/2006/main" xmlns:vyd="http://volga.yandex.com/schemas/document/model" xmlns:mc="http://schemas.openxmlformats.org/markup-compatibility/2006" xmlns:r="http://schemas.openxmlformats.org/officeDocument/2006/relationships" w:conformance="transitional" mc:Ignorable="vyd">
+<w:document xmlns:r="http://schemas.openxmlformats.org/officeDocument/2006/relationships" xmlns:w="http://schemas.openxmlformats.org/wordprocessingml/2006/main" xmlns:vyd="http://volga.yandex.com/schemas/document/model" xmlns:mc="http://schemas.openxmlformats.org/markup-compatibility/2006" w:conformance="transitional" mc:Ignorable="vyd">
   <w:background w:color="FFFFFF"/>
   <w:body vyd:_id="vyd:00000000000001">
     <w:p vyd:_id="vyd:000000000002hp">
@@ -3469,6 +3469,20 @@
                 <w:szCs w:val="24"/>
               </w:rPr>
             </w:pPr>
+            <w:r>
+              <w:rPr>
+                <w:rFonts w:ascii="Times New Roman" w:hAnsi="Times New Roman" w:eastAsia="Times New Roman" w:cs="Times New Roman"/>
+                <w:sz w:val="20"/>
+              </w:rPr>
+              <w:t vyd:_id="vyd:mogsve3lsa2zbw">Оценка и обоснование актуальности проекта. Описание и определение проблемного поля</w:t>
+            </w:r>
+            <w:r>
+              <w:rPr>
+                <w:rFonts w:ascii="Times New Roman" w:hAnsi="Times New Roman" w:eastAsia="Times New Roman" w:cs="Times New Roman"/>
+                <w:sz w:val="20"/>
+              </w:rPr>
+              <w:t vyd:_id="vyd:mogsve4i4iq5mf">Оценка и обоснование актуальности проекта. Описание и определение проблемного поля</w:t>
+            </w:r>
           </w:p>
         </w:tc>
         <w:tc vyd:_id="vyd:mob166h221cpfp">

</xml_diff>